<commit_message>
fsc note added in order confirmation
</commit_message>
<xml_diff>
--- a/electron/database/generate-document/templates/order-confirmation.docx
+++ b/electron/database/generate-document/templates/order-confirmation.docx
@@ -1392,37 +1392,17 @@
                 <w:sz w:val="20"/>
                 <w:szCs w:val="20"/>
               </w:rPr>
-              <w:t>{#</w:t>
-            </w:r>
-            <w:proofErr w:type="gramStart"/>
-            <w:r>
-              <w:rPr>
-                <w:rFonts w:ascii="Arial" w:hAnsi="Arial" w:cs="Arial"/>
-                <w:sz w:val="20"/>
-                <w:szCs w:val="20"/>
-              </w:rPr>
-              <w:t>IPItems}</w:t>
-            </w:r>
-            <w:r>
-              <w:rPr>
-                <w:rFonts w:ascii="Arial" w:hAnsi="Arial" w:cs="Arial"/>
-                <w:b/>
-                <w:bCs/>
-                <w:sz w:val="20"/>
-                <w:szCs w:val="20"/>
-              </w:rPr>
-              <w:t>{</w:t>
-            </w:r>
-            <w:proofErr w:type="gramEnd"/>
-            <w:r>
-              <w:rPr>
-                <w:rFonts w:ascii="Arial" w:hAnsi="Arial" w:cs="Arial"/>
-                <w:b/>
-                <w:bCs/>
-                <w:sz w:val="20"/>
-                <w:szCs w:val="20"/>
-              </w:rPr>
-              <w:t>thicknessDetail}</w:t>
+              <w:t>{#IPItems}</w:t>
+            </w:r>
+            <w:r>
+              <w:rPr>
+                <w:rFonts w:ascii="Arial" w:hAnsi="Arial" w:cs="Arial"/>
+                <w:b/>
+                <w:bCs/>
+                <w:sz w:val="20"/>
+                <w:szCs w:val="20"/>
+              </w:rPr>
+              <w:t>{thicknessDetail}</w:t>
             </w:r>
             <w:r>
               <w:rPr>
@@ -1531,6 +1511,58 @@
               </w:rPr>
               <w:t>{length} X {width} X {height} MM</w:t>
             </w:r>
+            <w:r>
+              <w:rPr>
+                <w:rFonts w:ascii="Arial" w:hAnsi="Arial" w:cs="Arial"/>
+                <w:b/>
+                <w:bCs/>
+                <w:sz w:val="20"/>
+                <w:szCs w:val="20"/>
+              </w:rPr>
+              <w:t xml:space="preserve"> </w:t>
+            </w:r>
+            <w:r>
+              <w:rPr>
+                <w:rFonts w:ascii="Arial" w:hAnsi="Arial" w:cs="Arial"/>
+                <w:b/>
+                <w:bCs/>
+                <w:sz w:val="20"/>
+                <w:szCs w:val="20"/>
+              </w:rPr>
+              <w:t xml:space="preserve">- </w:t>
+            </w:r>
+            <w:r>
+              <w:rPr>
+                <w:rFonts w:cstheme="minorHAnsi"/>
+                <w:b/>
+                <w:bCs/>
+                <w:sz w:val="20"/>
+                <w:szCs w:val="20"/>
+              </w:rPr>
+              <w:t>{</w:t>
+            </w:r>
+            <w:proofErr w:type="spellStart"/>
+            <w:r>
+              <w:rPr>
+                <w:rFonts w:cstheme="minorHAnsi"/>
+                <w:b/>
+                <w:bCs/>
+                <w:sz w:val="20"/>
+                <w:szCs w:val="20"/>
+              </w:rPr>
+              <w:t>fsc</w:t>
+            </w:r>
+            <w:proofErr w:type="spellEnd"/>
+            <w:r>
+              <w:rPr>
+                <w:rFonts w:cstheme="minorHAnsi"/>
+                <w:b/>
+                <w:bCs/>
+                <w:sz w:val="20"/>
+                <w:szCs w:val="20"/>
+              </w:rPr>
+              <w:t>}</w:t>
+            </w:r>
           </w:p>
         </w:tc>
       </w:tr>
@@ -1554,25 +1586,7 @@
                 <w:sz w:val="18"/>
                 <w:szCs w:val="18"/>
               </w:rPr>
-              <w:t>{#</w:t>
-            </w:r>
-            <w:proofErr w:type="gramStart"/>
-            <w:r>
-              <w:rPr>
-                <w:rFonts w:ascii="Arial" w:hAnsi="Arial" w:cs="Arial"/>
-                <w:sz w:val="18"/>
-                <w:szCs w:val="18"/>
-              </w:rPr>
-              <w:t>invoices}{</w:t>
-            </w:r>
-            <w:proofErr w:type="gramEnd"/>
-            <w:r>
-              <w:rPr>
-                <w:rFonts w:ascii="Arial" w:hAnsi="Arial" w:cs="Arial"/>
-                <w:sz w:val="18"/>
-                <w:szCs w:val="18"/>
-              </w:rPr>
-              <w:t>containerFrom}{#containerTo} to {</w:t>
+              <w:t>{#invoices}{containerFrom}{#containerTo} to {</w:t>
             </w:r>
             <w:proofErr w:type="spellStart"/>
             <w:r>
@@ -1619,12 +1633,39 @@
           <w:p>
             <w:pPr>
               <w:ind w:right="113"/>
-              <w:rPr>
-                <w:rFonts w:ascii="Arial" w:hAnsi="Arial" w:cs="Arial"/>
-                <w:sz w:val="18"/>
-                <w:szCs w:val="18"/>
-              </w:rPr>
-            </w:pPr>
+              <w:jc w:val="center"/>
+              <w:rPr>
+                <w:rFonts w:ascii="Arial" w:hAnsi="Arial" w:cs="Arial"/>
+                <w:sz w:val="18"/>
+                <w:szCs w:val="18"/>
+              </w:rPr>
+            </w:pPr>
+            <w:r>
+              <w:rPr>
+                <w:rFonts w:ascii="Arial" w:hAnsi="Arial" w:cs="Arial"/>
+                <w:sz w:val="18"/>
+                <w:szCs w:val="18"/>
+              </w:rPr>
+              <w:t>{</w:t>
+            </w:r>
+            <w:proofErr w:type="spellStart"/>
+            <w:r>
+              <w:rPr>
+                <w:rFonts w:ascii="Arial" w:hAnsi="Arial" w:cs="Arial"/>
+                <w:sz w:val="18"/>
+                <w:szCs w:val="18"/>
+              </w:rPr>
+              <w:t>materialGrade</w:t>
+            </w:r>
+            <w:proofErr w:type="spellEnd"/>
+            <w:r>
+              <w:rPr>
+                <w:rFonts w:ascii="Arial" w:hAnsi="Arial" w:cs="Arial"/>
+                <w:sz w:val="18"/>
+                <w:szCs w:val="18"/>
+              </w:rPr>
+              <w:t>}</w:t>
+            </w:r>
           </w:p>
         </w:tc>
         <w:tc>
@@ -1781,25 +1822,7 @@
                 <w:sz w:val="18"/>
                 <w:szCs w:val="18"/>
               </w:rPr>
-              <w:t>{value}{/</w:t>
-            </w:r>
-            <w:proofErr w:type="gramStart"/>
-            <w:r>
-              <w:rPr>
-                <w:rFonts w:ascii="Arial" w:hAnsi="Arial" w:cs="Arial"/>
-                <w:sz w:val="18"/>
-                <w:szCs w:val="18"/>
-              </w:rPr>
-              <w:t>invoices}{</w:t>
-            </w:r>
-            <w:proofErr w:type="gramEnd"/>
-            <w:r>
-              <w:rPr>
-                <w:rFonts w:ascii="Arial" w:hAnsi="Arial" w:cs="Arial"/>
-                <w:sz w:val="18"/>
-                <w:szCs w:val="18"/>
-              </w:rPr>
-              <w:t>/</w:t>
+              <w:t>{value}{/invoices}{/</w:t>
             </w:r>
             <w:proofErr w:type="spellStart"/>
             <w:r>
@@ -3181,7 +3204,6 @@
               <w:t>BRANCH {</w:t>
             </w:r>
             <w:proofErr w:type="spellStart"/>
-            <w:proofErr w:type="gramStart"/>
             <w:r>
               <w:rPr>
                 <w:rFonts w:ascii="Arial" w:hAnsi="Arial" w:cs="Arial"/>
@@ -3199,30 +3221,9 @@
                 <w:szCs w:val="18"/>
                 <w:lang w:val="en-IN"/>
               </w:rPr>
-              <w:t xml:space="preserve">}   </w:t>
-            </w:r>
-            <w:proofErr w:type="gramEnd"/>
-            <w:r>
-              <w:rPr>
-                <w:rFonts w:ascii="Arial" w:hAnsi="Arial" w:cs="Arial"/>
-                <w:sz w:val="18"/>
-                <w:szCs w:val="18"/>
-                <w:lang w:val="en-IN"/>
-              </w:rPr>
-              <w:t xml:space="preserve">      </w:t>
-            </w:r>
-            <w:proofErr w:type="gramStart"/>
-            <w:r>
-              <w:rPr>
-                <w:rFonts w:ascii="Arial" w:hAnsi="Arial" w:cs="Arial"/>
-                <w:sz w:val="18"/>
-                <w:szCs w:val="18"/>
-                <w:lang w:val="en-IN"/>
-              </w:rPr>
-              <w:t xml:space="preserve">   {</w:t>
+              <w:t>}            {</w:t>
             </w:r>
             <w:proofErr w:type="spellStart"/>
-            <w:proofErr w:type="gramEnd"/>
             <w:r>
               <w:rPr>
                 <w:rFonts w:ascii="Arial" w:hAnsi="Arial" w:cs="Arial"/>
@@ -3643,7 +3644,6 @@
     <w:r>
       <w:t xml:space="preserve">      </w:t>
     </w:r>
-    <w:proofErr w:type="gramStart"/>
     <w:r>
       <w:rPr>
         <w:spacing w:val="60"/>
@@ -3660,9 +3660,8 @@
       <w:rPr>
         <w:spacing w:val="60"/>
       </w:rPr>
-      <w:t xml:space="preserve"> ICA</w:t>
-    </w:r>
-    <w:proofErr w:type="gramEnd"/>
+      <w:t xml:space="preserve"> ICA </w:t>
+    </w:r>
     <w:r>
       <w:rPr>
         <w:spacing w:val="60"/>
@@ -3673,34 +3672,20 @@
       <w:rPr>
         <w:spacing w:val="60"/>
       </w:rPr>
+      <w:t>(I)</w:t>
+    </w:r>
+    <w:r>
+      <w:rPr>
+        <w:spacing w:val="60"/>
+      </w:rPr>
       <w:t xml:space="preserve"> </w:t>
     </w:r>
     <w:r>
       <w:rPr>
         <w:spacing w:val="60"/>
       </w:rPr>
-      <w:t>(I</w:t>
-    </w:r>
-    <w:proofErr w:type="gramStart"/>
-    <w:r>
-      <w:rPr>
-        <w:spacing w:val="60"/>
-      </w:rPr>
-      <w:t>)</w:t>
-    </w:r>
-    <w:r>
-      <w:rPr>
-        <w:spacing w:val="60"/>
-      </w:rPr>
-      <w:t xml:space="preserve"> </w:t>
-    </w:r>
-    <w:r>
-      <w:rPr>
-        <w:spacing w:val="60"/>
-      </w:rPr>
       <w:t xml:space="preserve"> LTD</w:t>
     </w:r>
-    <w:proofErr w:type="gramEnd"/>
   </w:p>
   <w:p>
     <w:pPr>
@@ -4002,15 +3987,6 @@
         <w:color w:val="auto"/>
       </w:rPr>
       <w:tab/>
-    </w:r>
-    <w:proofErr w:type="gramStart"/>
-    <w:r>
-      <w:rPr>
-        <w:rFonts w:ascii="Arial" w:hAnsi="Arial" w:cs="Arial"/>
-        <w:b/>
-        <w:bCs/>
-        <w:color w:val="auto"/>
-      </w:rPr>
       <w:t>D</w:t>
     </w:r>
     <w:r>
@@ -4033,7 +4009,6 @@
       </w:rPr>
       <w:t>.</w:t>
     </w:r>
-    <w:proofErr w:type="gramEnd"/>
   </w:p>
   <w:p>
     <w:pPr>
@@ -5497,7 +5472,6 @@
   <w:style w:type="character" w:default="1" w:styleId="DefaultParagraphFont">
     <w:name w:val="Default Paragraph Font"/>
     <w:uiPriority w:val="1"/>
-    <w:semiHidden/>
     <w:unhideWhenUsed/>
   </w:style>
   <w:style w:type="table" w:default="1" w:styleId="TableNormal">

</xml_diff>

<commit_message>
report changes country vice
</commit_message>
<xml_diff>
--- a/electron/database/generate-document/templates/order-confirmation.docx
+++ b/electron/database/generate-document/templates/order-confirmation.docx
@@ -1058,7 +1058,8 @@
       </w:tblPr>
       <w:tblGrid>
         <w:gridCol w:w="1583"/>
-        <w:gridCol w:w="3673"/>
+        <w:gridCol w:w="2127"/>
+        <w:gridCol w:w="1546"/>
         <w:gridCol w:w="1430"/>
         <w:gridCol w:w="1146"/>
         <w:gridCol w:w="1271"/>
@@ -1124,7 +1125,7 @@
         </w:tc>
         <w:tc>
           <w:tcPr>
-            <w:tcW w:w="3673" w:type="dxa"/>
+            <w:tcW w:w="2127" w:type="dxa"/>
           </w:tcPr>
           <w:p>
             <w:pPr>
@@ -1132,16 +1133,318 @@
               <w:jc w:val="center"/>
               <w:rPr>
                 <w:rFonts w:ascii="Arial" w:hAnsi="Arial" w:cs="Arial"/>
-              </w:rPr>
-            </w:pPr>
+                <w:sz w:val="18"/>
+                <w:szCs w:val="18"/>
+              </w:rPr>
+            </w:pPr>
+            <w:r>
+              <w:rPr>
+                <w:rFonts w:cstheme="minorHAnsi"/>
+                <w:b/>
+                <w:bCs/>
+                <w:sz w:val="18"/>
+                <w:szCs w:val="18"/>
+              </w:rPr>
+              <w:t>{#isAus}ASW No{/</w:t>
+            </w:r>
+            <w:proofErr w:type="spellStart"/>
+            <w:r>
+              <w:rPr>
+                <w:rFonts w:cstheme="minorHAnsi"/>
+                <w:b/>
+                <w:bCs/>
+                <w:sz w:val="18"/>
+                <w:szCs w:val="18"/>
+              </w:rPr>
+              <w:t>isAus</w:t>
+            </w:r>
+            <w:proofErr w:type="spellEnd"/>
+            <w:r>
+              <w:rPr>
+                <w:rFonts w:cstheme="minorHAnsi"/>
+                <w:b/>
+                <w:bCs/>
+                <w:sz w:val="18"/>
+                <w:szCs w:val="18"/>
+              </w:rPr>
+              <w:t>}{#</w:t>
+            </w:r>
+            <w:proofErr w:type="spellStart"/>
+            <w:r>
+              <w:rPr>
+                <w:rFonts w:cstheme="minorHAnsi"/>
+                <w:b/>
+                <w:bCs/>
+                <w:sz w:val="18"/>
+                <w:szCs w:val="18"/>
+                <w:lang w:val="en-IN"/>
+              </w:rPr>
+              <w:t>isUK</w:t>
+            </w:r>
+            <w:proofErr w:type="spellEnd"/>
+            <w:r>
+              <w:rPr>
+                <w:rFonts w:cstheme="minorHAnsi"/>
+                <w:b/>
+                <w:bCs/>
+                <w:sz w:val="18"/>
+                <w:szCs w:val="18"/>
+              </w:rPr>
+              <w:t>}</w:t>
+            </w:r>
             <w:r>
               <w:rPr>
                 <w:rFonts w:ascii="Arial" w:hAnsi="Arial" w:cs="Arial"/>
                 <w:b/>
                 <w:spacing w:val="-4"/>
                 <w:sz w:val="18"/>
+                <w:szCs w:val="18"/>
               </w:rPr>
               <w:t>Code</w:t>
+            </w:r>
+            <w:r>
+              <w:rPr>
+                <w:rFonts w:cstheme="minorHAnsi"/>
+                <w:b/>
+                <w:bCs/>
+                <w:sz w:val="18"/>
+                <w:szCs w:val="18"/>
+              </w:rPr>
+              <w:t>{/</w:t>
+            </w:r>
+            <w:proofErr w:type="spellStart"/>
+            <w:r>
+              <w:rPr>
+                <w:rFonts w:cstheme="minorHAnsi"/>
+                <w:b/>
+                <w:bCs/>
+                <w:sz w:val="18"/>
+                <w:szCs w:val="18"/>
+              </w:rPr>
+              <w:t>isUK</w:t>
+            </w:r>
+            <w:proofErr w:type="spellEnd"/>
+            <w:r>
+              <w:rPr>
+                <w:rFonts w:cstheme="minorHAnsi"/>
+                <w:b/>
+                <w:bCs/>
+                <w:sz w:val="18"/>
+                <w:szCs w:val="18"/>
+              </w:rPr>
+              <w:t>}{#</w:t>
+            </w:r>
+            <w:proofErr w:type="spellStart"/>
+            <w:r>
+              <w:rPr>
+                <w:rFonts w:cstheme="minorHAnsi"/>
+                <w:b/>
+                <w:bCs/>
+                <w:sz w:val="18"/>
+                <w:szCs w:val="18"/>
+                <w:lang w:val="en-IN"/>
+              </w:rPr>
+              <w:t>isGen</w:t>
+            </w:r>
+            <w:proofErr w:type="spellEnd"/>
+            <w:r>
+              <w:rPr>
+                <w:rFonts w:cstheme="minorHAnsi"/>
+                <w:b/>
+                <w:bCs/>
+                <w:sz w:val="18"/>
+                <w:szCs w:val="18"/>
+              </w:rPr>
+              <w:t>}</w:t>
+            </w:r>
+            <w:r>
+              <w:rPr>
+                <w:rFonts w:ascii="Arial" w:hAnsi="Arial" w:cs="Arial"/>
+                <w:b/>
+                <w:spacing w:val="-4"/>
+                <w:sz w:val="18"/>
+                <w:szCs w:val="18"/>
+              </w:rPr>
+              <w:t>Grade</w:t>
+            </w:r>
+            <w:r>
+              <w:rPr>
+                <w:rFonts w:cstheme="minorHAnsi"/>
+                <w:b/>
+                <w:bCs/>
+                <w:sz w:val="18"/>
+                <w:szCs w:val="18"/>
+              </w:rPr>
+              <w:t>{/</w:t>
+            </w:r>
+            <w:proofErr w:type="spellStart"/>
+            <w:r>
+              <w:rPr>
+                <w:rFonts w:cstheme="minorHAnsi"/>
+                <w:b/>
+                <w:bCs/>
+                <w:sz w:val="18"/>
+                <w:szCs w:val="18"/>
+                <w:lang w:val="en-IN"/>
+              </w:rPr>
+              <w:t>isGen</w:t>
+            </w:r>
+            <w:proofErr w:type="spellEnd"/>
+            <w:r>
+              <w:rPr>
+                <w:rFonts w:cstheme="minorHAnsi"/>
+                <w:b/>
+                <w:bCs/>
+                <w:sz w:val="18"/>
+                <w:szCs w:val="18"/>
+              </w:rPr>
+              <w:t>}</w:t>
+            </w:r>
+          </w:p>
+        </w:tc>
+        <w:tc>
+          <w:tcPr>
+            <w:tcW w:w="1546" w:type="dxa"/>
+          </w:tcPr>
+          <w:p>
+            <w:pPr>
+              <w:ind w:right="113"/>
+              <w:jc w:val="center"/>
+              <w:rPr>
+                <w:rFonts w:ascii="Arial" w:hAnsi="Arial" w:cs="Arial"/>
+                <w:sz w:val="18"/>
+                <w:szCs w:val="18"/>
+              </w:rPr>
+            </w:pPr>
+            <w:r>
+              <w:rPr>
+                <w:rFonts w:cstheme="minorHAnsi"/>
+                <w:b/>
+                <w:bCs/>
+                <w:sz w:val="18"/>
+                <w:szCs w:val="18"/>
+              </w:rPr>
+              <w:t xml:space="preserve">{#isAus}ASW </w:t>
+            </w:r>
+            <w:proofErr w:type="spellStart"/>
+            <w:r>
+              <w:rPr>
+                <w:rFonts w:cstheme="minorHAnsi"/>
+                <w:b/>
+                <w:bCs/>
+                <w:sz w:val="18"/>
+                <w:szCs w:val="18"/>
+              </w:rPr>
+              <w:t>PO.</w:t>
+            </w:r>
+            <w:r>
+              <w:rPr>
+                <w:rFonts w:cstheme="minorHAnsi"/>
+                <w:b/>
+                <w:bCs/>
+                <w:sz w:val="18"/>
+                <w:szCs w:val="18"/>
+              </w:rPr>
+              <w:t>No</w:t>
+            </w:r>
+            <w:proofErr w:type="spellEnd"/>
+            <w:r>
+              <w:rPr>
+                <w:rFonts w:cstheme="minorHAnsi"/>
+                <w:b/>
+                <w:bCs/>
+                <w:sz w:val="18"/>
+                <w:szCs w:val="18"/>
+              </w:rPr>
+              <w:t>{/</w:t>
+            </w:r>
+            <w:proofErr w:type="spellStart"/>
+            <w:r>
+              <w:rPr>
+                <w:rFonts w:cstheme="minorHAnsi"/>
+                <w:b/>
+                <w:bCs/>
+                <w:sz w:val="18"/>
+                <w:szCs w:val="18"/>
+              </w:rPr>
+              <w:t>isAus</w:t>
+            </w:r>
+            <w:proofErr w:type="spellEnd"/>
+            <w:r>
+              <w:rPr>
+                <w:rFonts w:cstheme="minorHAnsi"/>
+                <w:b/>
+                <w:bCs/>
+                <w:sz w:val="18"/>
+                <w:szCs w:val="18"/>
+              </w:rPr>
+              <w:t>}{#</w:t>
+            </w:r>
+            <w:proofErr w:type="spellStart"/>
+            <w:r>
+              <w:rPr>
+                <w:rFonts w:cstheme="minorHAnsi"/>
+                <w:b/>
+                <w:bCs/>
+                <w:sz w:val="18"/>
+                <w:szCs w:val="18"/>
+                <w:lang w:val="en-IN"/>
+              </w:rPr>
+              <w:t>isGen</w:t>
+            </w:r>
+            <w:proofErr w:type="spellEnd"/>
+            <w:r>
+              <w:rPr>
+                <w:rFonts w:cstheme="minorHAnsi"/>
+                <w:b/>
+                <w:bCs/>
+                <w:sz w:val="18"/>
+                <w:szCs w:val="18"/>
+              </w:rPr>
+              <w:t>}</w:t>
+            </w:r>
+            <w:r>
+              <w:rPr>
+                <w:rFonts w:ascii="Arial" w:hAnsi="Arial" w:cs="Arial"/>
+                <w:b/>
+                <w:spacing w:val="-4"/>
+                <w:sz w:val="18"/>
+                <w:szCs w:val="18"/>
+              </w:rPr>
+              <w:t>Brand</w:t>
+            </w:r>
+            <w:r>
+              <w:rPr>
+                <w:rFonts w:cstheme="minorHAnsi"/>
+                <w:b/>
+                <w:bCs/>
+                <w:sz w:val="18"/>
+                <w:szCs w:val="18"/>
+              </w:rPr>
+              <w:t>{/</w:t>
+            </w:r>
+            <w:proofErr w:type="spellStart"/>
+            <w:r>
+              <w:rPr>
+                <w:rFonts w:cstheme="minorHAnsi"/>
+                <w:b/>
+                <w:bCs/>
+                <w:sz w:val="18"/>
+                <w:szCs w:val="18"/>
+                <w:lang w:val="en-IN"/>
+              </w:rPr>
+              <w:t>isGen</w:t>
+            </w:r>
+            <w:proofErr w:type="spellEnd"/>
+            <w:r>
+              <w:rPr>
+                <w:rFonts w:cstheme="minorHAnsi"/>
+                <w:b/>
+                <w:bCs/>
+                <w:sz w:val="18"/>
+                <w:szCs w:val="18"/>
+              </w:rPr>
+              <w:t>}</w:t>
             </w:r>
           </w:p>
         </w:tc>
@@ -1365,7 +1668,7 @@
         <w:tc>
           <w:tcPr>
             <w:tcW w:w="11783" w:type="dxa"/>
-            <w:gridSpan w:val="7"/>
+            <w:gridSpan w:val="8"/>
           </w:tcPr>
           <w:p>
             <w:pPr>
@@ -1628,7 +1931,7 @@
         </w:tc>
         <w:tc>
           <w:tcPr>
-            <w:tcW w:w="3673" w:type="dxa"/>
+            <w:tcW w:w="2127" w:type="dxa"/>
           </w:tcPr>
           <w:p>
             <w:pPr>
@@ -1661,6 +1964,124 @@
             <w:r>
               <w:rPr>
                 <w:rFonts w:ascii="Arial" w:hAnsi="Arial" w:cs="Arial"/>
+                <w:sz w:val="18"/>
+                <w:szCs w:val="18"/>
+              </w:rPr>
+              <w:t>}</w:t>
+            </w:r>
+          </w:p>
+        </w:tc>
+        <w:tc>
+          <w:tcPr>
+            <w:tcW w:w="1546" w:type="dxa"/>
+          </w:tcPr>
+          <w:p>
+            <w:pPr>
+              <w:ind w:right="113"/>
+              <w:jc w:val="center"/>
+              <w:rPr>
+                <w:rFonts w:ascii="Arial" w:hAnsi="Arial" w:cs="Arial"/>
+                <w:sz w:val="18"/>
+                <w:szCs w:val="18"/>
+              </w:rPr>
+            </w:pPr>
+            <w:r>
+              <w:rPr>
+                <w:rFonts w:cstheme="minorHAnsi"/>
+                <w:sz w:val="18"/>
+                <w:szCs w:val="18"/>
+              </w:rPr>
+              <w:t>{</w:t>
+            </w:r>
+            <w:r>
+              <w:rPr>
+                <w:rFonts w:cstheme="minorHAnsi"/>
+                <w:sz w:val="18"/>
+                <w:szCs w:val="18"/>
+              </w:rPr>
+              <w:t>^</w:t>
+            </w:r>
+            <w:proofErr w:type="spellStart"/>
+            <w:r>
+              <w:rPr>
+                <w:rFonts w:cstheme="minorHAnsi"/>
+                <w:sz w:val="18"/>
+                <w:szCs w:val="18"/>
+              </w:rPr>
+              <w:t>is</w:t>
+            </w:r>
+            <w:r>
+              <w:rPr>
+                <w:rFonts w:cstheme="minorHAnsi"/>
+                <w:sz w:val="18"/>
+                <w:szCs w:val="18"/>
+              </w:rPr>
+              <w:t>UK</w:t>
+            </w:r>
+            <w:proofErr w:type="spellEnd"/>
+            <w:r>
+              <w:rPr>
+                <w:rFonts w:cstheme="minorHAnsi"/>
+                <w:sz w:val="18"/>
+                <w:szCs w:val="18"/>
+              </w:rPr>
+              <w:t>}</w:t>
+            </w:r>
+            <w:r>
+              <w:rPr>
+                <w:rFonts w:cstheme="minorHAnsi"/>
+                <w:sz w:val="18"/>
+                <w:szCs w:val="18"/>
+              </w:rPr>
+              <w:t>{</w:t>
+            </w:r>
+            <w:proofErr w:type="spellStart"/>
+            <w:r>
+              <w:rPr>
+                <w:rFonts w:cstheme="minorHAnsi"/>
+                <w:sz w:val="18"/>
+                <w:szCs w:val="18"/>
+              </w:rPr>
+              <w:t>brandName</w:t>
+            </w:r>
+            <w:proofErr w:type="spellEnd"/>
+            <w:r>
+              <w:rPr>
+                <w:rFonts w:cstheme="minorHAnsi"/>
+                <w:sz w:val="18"/>
+                <w:szCs w:val="18"/>
+              </w:rPr>
+              <w:t>}</w:t>
+            </w:r>
+            <w:r>
+              <w:rPr>
+                <w:rFonts w:cstheme="minorHAnsi"/>
+                <w:sz w:val="18"/>
+                <w:szCs w:val="18"/>
+              </w:rPr>
+              <w:t>{/</w:t>
+            </w:r>
+            <w:proofErr w:type="spellStart"/>
+            <w:r>
+              <w:rPr>
+                <w:rFonts w:cstheme="minorHAnsi"/>
+                <w:sz w:val="18"/>
+                <w:szCs w:val="18"/>
+              </w:rPr>
+              <w:t>is</w:t>
+            </w:r>
+            <w:r>
+              <w:rPr>
+                <w:rFonts w:cstheme="minorHAnsi"/>
+                <w:sz w:val="18"/>
+                <w:szCs w:val="18"/>
+              </w:rPr>
+              <w:t>UK</w:t>
+            </w:r>
+            <w:proofErr w:type="spellEnd"/>
+            <w:r>
+              <w:rPr>
+                <w:rFonts w:cstheme="minorHAnsi"/>
                 <w:sz w:val="18"/>
                 <w:szCs w:val="18"/>
               </w:rPr>
@@ -1862,6 +2283,7 @@
         <w:tc>
           <w:tcPr>
             <w:tcW w:w="3673" w:type="dxa"/>
+            <w:gridSpan w:val="2"/>
           </w:tcPr>
           <w:p>
             <w:pPr>
@@ -1957,6 +2379,7 @@
         <w:tc>
           <w:tcPr>
             <w:tcW w:w="3673" w:type="dxa"/>
+            <w:gridSpan w:val="2"/>
           </w:tcPr>
           <w:p>
             <w:pPr>
@@ -2134,6 +2557,7 @@
         <w:tc>
           <w:tcPr>
             <w:tcW w:w="3673" w:type="dxa"/>
+            <w:gridSpan w:val="2"/>
           </w:tcPr>
           <w:p>
             <w:pPr>
@@ -2289,6 +2713,7 @@
         <w:tc>
           <w:tcPr>
             <w:tcW w:w="3673" w:type="dxa"/>
+            <w:gridSpan w:val="2"/>
           </w:tcPr>
           <w:p>
             <w:pPr>
@@ -2438,6 +2863,7 @@
         <w:tc>
           <w:tcPr>
             <w:tcW w:w="3673" w:type="dxa"/>
+            <w:gridSpan w:val="2"/>
           </w:tcPr>
           <w:p>
             <w:pPr>
@@ -2587,6 +3013,7 @@
         <w:tc>
           <w:tcPr>
             <w:tcW w:w="3673" w:type="dxa"/>
+            <w:gridSpan w:val="2"/>
           </w:tcPr>
           <w:p>
             <w:pPr>
@@ -2704,7 +3131,7 @@
         <w:tc>
           <w:tcPr>
             <w:tcW w:w="10230" w:type="dxa"/>
-            <w:gridSpan w:val="6"/>
+            <w:gridSpan w:val="7"/>
           </w:tcPr>
           <w:p>
             <w:pPr>
@@ -3049,6 +3476,7 @@
         <w:tc>
           <w:tcPr>
             <w:tcW w:w="3673" w:type="dxa"/>
+            <w:gridSpan w:val="2"/>
           </w:tcPr>
           <w:p>
             <w:pPr>
@@ -3297,6 +3725,7 @@
         <w:tc>
           <w:tcPr>
             <w:tcW w:w="3673" w:type="dxa"/>
+            <w:gridSpan w:val="2"/>
           </w:tcPr>
           <w:p>
             <w:pPr>
@@ -3408,6 +3837,7 @@
         <w:tc>
           <w:tcPr>
             <w:tcW w:w="3673" w:type="dxa"/>
+            <w:gridSpan w:val="2"/>
           </w:tcPr>
           <w:p>
             <w:pPr>
@@ -3493,7 +3923,7 @@
         <w:tc>
           <w:tcPr>
             <w:tcW w:w="11783" w:type="dxa"/>
-            <w:gridSpan w:val="7"/>
+            <w:gridSpan w:val="8"/>
           </w:tcPr>
           <w:p>
             <w:pPr>

</xml_diff>

<commit_message>
bug fix format rate 10.5 to 10.50 & default currency handle
</commit_message>
<xml_diff>
--- a/electron/database/generate-document/templates/order-confirmation.docx
+++ b/electron/database/generate-document/templates/order-confirmation.docx
@@ -94,29 +94,7 @@
                 <w:sz w:val="20"/>
                 <w:szCs w:val="20"/>
               </w:rPr>
-              <w:t>{</w:t>
-            </w:r>
-            <w:proofErr w:type="spellStart"/>
-            <w:r>
-              <w:rPr>
-                <w:rFonts w:asciiTheme="minorHAnsi" w:hAnsiTheme="minorHAnsi" w:cstheme="minorHAnsi"/>
-                <w:b/>
-                <w:bCs/>
-                <w:sz w:val="20"/>
-                <w:szCs w:val="20"/>
-              </w:rPr>
-              <w:t>consigneeName</w:t>
-            </w:r>
-            <w:proofErr w:type="spellEnd"/>
-            <w:r>
-              <w:rPr>
-                <w:rFonts w:asciiTheme="minorHAnsi" w:hAnsiTheme="minorHAnsi" w:cstheme="minorHAnsi"/>
-                <w:b/>
-                <w:bCs/>
-                <w:sz w:val="20"/>
-                <w:szCs w:val="20"/>
-              </w:rPr>
-              <w:t>}</w:t>
+              <w:t>{consigneeName}</w:t>
             </w:r>
           </w:p>
           <w:p>
@@ -141,20 +119,98 @@
                 <w:sz w:val="20"/>
                 <w:szCs w:val="20"/>
               </w:rPr>
-              <w:t>{</w:t>
-            </w:r>
-            <w:proofErr w:type="spellStart"/>
-            <w:r>
-              <w:rPr>
-                <w:rFonts w:asciiTheme="minorHAnsi" w:hAnsiTheme="minorHAnsi" w:cstheme="minorHAnsi"/>
-                <w:b/>
-                <w:bCs/>
-                <w:sz w:val="20"/>
-                <w:szCs w:val="20"/>
-              </w:rPr>
-              <w:t>consigneeAddress</w:t>
-            </w:r>
-            <w:proofErr w:type="spellEnd"/>
+              <w:t>{consigneeAddress}</w:t>
+            </w:r>
+            <w:r>
+              <w:rPr>
+                <w:rFonts w:asciiTheme="minorHAnsi" w:hAnsiTheme="minorHAnsi" w:cstheme="minorHAnsi"/>
+                <w:b/>
+                <w:bCs/>
+                <w:sz w:val="20"/>
+                <w:szCs w:val="20"/>
+              </w:rPr>
+              <w:t xml:space="preserve"> </w:t>
+            </w:r>
+            <w:r>
+              <w:rPr>
+                <w:rFonts w:asciiTheme="minorHAnsi" w:hAnsiTheme="minorHAnsi" w:cstheme="minorHAnsi"/>
+                <w:b/>
+                <w:bCs/>
+                <w:sz w:val="20"/>
+                <w:szCs w:val="20"/>
+              </w:rPr>
+              <w:t>{consigneeCity}</w:t>
+            </w:r>
+            <w:r>
+              <w:rPr>
+                <w:rFonts w:asciiTheme="minorHAnsi" w:hAnsiTheme="minorHAnsi" w:cstheme="minorHAnsi"/>
+                <w:b/>
+                <w:bCs/>
+                <w:sz w:val="20"/>
+                <w:szCs w:val="20"/>
+              </w:rPr>
+              <w:t xml:space="preserve"> </w:t>
+            </w:r>
+            <w:r>
+              <w:rPr>
+                <w:rFonts w:asciiTheme="minorHAnsi" w:hAnsiTheme="minorHAnsi" w:cstheme="minorHAnsi"/>
+                <w:b/>
+                <w:bCs/>
+                <w:sz w:val="20"/>
+                <w:szCs w:val="20"/>
+              </w:rPr>
+              <w:t>{consigneeState}</w:t>
+            </w:r>
+            <w:r>
+              <w:rPr>
+                <w:rFonts w:asciiTheme="minorHAnsi" w:hAnsiTheme="minorHAnsi" w:cstheme="minorHAnsi"/>
+                <w:b/>
+                <w:bCs/>
+                <w:sz w:val="20"/>
+                <w:szCs w:val="20"/>
+              </w:rPr>
+              <w:t xml:space="preserve"> </w:t>
+            </w:r>
+            <w:r>
+              <w:rPr>
+                <w:rFonts w:asciiTheme="minorHAnsi" w:hAnsiTheme="minorHAnsi" w:cstheme="minorHAnsi"/>
+                <w:b/>
+                <w:bCs/>
+                <w:sz w:val="20"/>
+                <w:szCs w:val="20"/>
+              </w:rPr>
+              <w:t>{consigneeCountry}</w:t>
+            </w:r>
+            <w:r>
+              <w:rPr>
+                <w:rFonts w:asciiTheme="minorHAnsi" w:hAnsiTheme="minorHAnsi" w:cstheme="minorHAnsi"/>
+                <w:b/>
+                <w:bCs/>
+                <w:sz w:val="20"/>
+                <w:szCs w:val="20"/>
+              </w:rPr>
+              <w:t xml:space="preserve"> </w:t>
+            </w:r>
+            <w:r>
+              <w:rPr>
+                <w:rFonts w:asciiTheme="minorHAnsi" w:hAnsiTheme="minorHAnsi" w:cstheme="minorHAnsi"/>
+                <w:b/>
+                <w:bCs/>
+                <w:sz w:val="20"/>
+                <w:szCs w:val="20"/>
+              </w:rPr>
+              <w:t>{#</w:t>
+            </w:r>
+            <w:r>
+              <w:rPr>
+                <w:rFonts w:asciiTheme="minorHAnsi" w:hAnsiTheme="minorHAnsi" w:cstheme="minorHAnsi"/>
+                <w:b/>
+                <w:bCs/>
+                <w:sz w:val="20"/>
+                <w:szCs w:val="20"/>
+              </w:rPr>
+              <w:t>consigneeZip</w:t>
+            </w:r>
             <w:r>
               <w:rPr>
                 <w:rFonts w:asciiTheme="minorHAnsi" w:hAnsiTheme="minorHAnsi" w:cstheme="minorHAnsi"/>
@@ -165,7 +221,81 @@
               </w:rPr>
               <w:t>}</w:t>
             </w:r>
-          </w:p>
+            <w:r>
+              <w:rPr>
+                <w:rFonts w:asciiTheme="minorHAnsi" w:hAnsiTheme="minorHAnsi" w:cstheme="minorHAnsi"/>
+                <w:b/>
+                <w:bCs/>
+                <w:sz w:val="20"/>
+                <w:szCs w:val="20"/>
+              </w:rPr>
+              <w:t>-</w:t>
+            </w:r>
+            <w:r>
+              <w:rPr>
+                <w:rFonts w:asciiTheme="minorHAnsi" w:hAnsiTheme="minorHAnsi" w:cstheme="minorHAnsi"/>
+                <w:b/>
+                <w:bCs/>
+                <w:sz w:val="20"/>
+                <w:szCs w:val="20"/>
+              </w:rPr>
+              <w:t>{consigneeZip}</w:t>
+            </w:r>
+            <w:r>
+              <w:rPr>
+                <w:rFonts w:asciiTheme="minorHAnsi" w:hAnsiTheme="minorHAnsi" w:cstheme="minorHAnsi"/>
+                <w:b/>
+                <w:bCs/>
+                <w:sz w:val="20"/>
+                <w:szCs w:val="20"/>
+              </w:rPr>
+              <w:t>{/</w:t>
+            </w:r>
+            <w:r>
+              <w:rPr>
+                <w:rFonts w:asciiTheme="minorHAnsi" w:hAnsiTheme="minorHAnsi" w:cstheme="minorHAnsi"/>
+                <w:b/>
+                <w:bCs/>
+                <w:sz w:val="20"/>
+                <w:szCs w:val="20"/>
+              </w:rPr>
+              <w:t>consigneeZip</w:t>
+            </w:r>
+            <w:r>
+              <w:rPr>
+                <w:rFonts w:asciiTheme="minorHAnsi" w:hAnsiTheme="minorHAnsi" w:cstheme="minorHAnsi"/>
+                <w:b/>
+                <w:bCs/>
+                <w:sz w:val="20"/>
+                <w:szCs w:val="20"/>
+              </w:rPr>
+              <w:t>}</w:t>
+            </w:r>
+          </w:p>
+        </w:tc>
+        <w:tc>
+          <w:tcPr>
+            <w:tcW w:w="283" w:type="dxa"/>
+          </w:tcPr>
+          <w:p>
+            <w:pPr>
+              <w:ind w:right="227"/>
+              <w:jc w:val="right"/>
+              <w:rPr>
+                <w:rFonts w:asciiTheme="minorHAnsi" w:hAnsiTheme="minorHAnsi" w:cstheme="minorHAnsi"/>
+                <w:b/>
+                <w:spacing w:val="-2"/>
+                <w:sz w:val="20"/>
+                <w:szCs w:val="24"/>
+              </w:rPr>
+            </w:pPr>
+          </w:p>
+        </w:tc>
+        <w:tc>
+          <w:tcPr>
+            <w:tcW w:w="4536" w:type="dxa"/>
+            <w:gridSpan w:val="5"/>
+          </w:tcPr>
           <w:p>
             <w:pPr>
               <w:tabs>
@@ -180,151 +310,7 @@
                 <w:szCs w:val="20"/>
               </w:rPr>
             </w:pPr>
-            <w:r>
-              <w:rPr>
-                <w:rFonts w:asciiTheme="minorHAnsi" w:hAnsiTheme="minorHAnsi" w:cstheme="minorHAnsi"/>
-                <w:b/>
-                <w:bCs/>
-                <w:sz w:val="20"/>
-                <w:szCs w:val="20"/>
-              </w:rPr>
-              <w:t>{</w:t>
-            </w:r>
-            <w:proofErr w:type="spellStart"/>
-            <w:r>
-              <w:rPr>
-                <w:rFonts w:asciiTheme="minorHAnsi" w:hAnsiTheme="minorHAnsi" w:cstheme="minorHAnsi"/>
-                <w:b/>
-                <w:bCs/>
-                <w:sz w:val="20"/>
-                <w:szCs w:val="20"/>
-              </w:rPr>
-              <w:t>consigneeCity</w:t>
-            </w:r>
-            <w:proofErr w:type="spellEnd"/>
-            <w:r>
-              <w:rPr>
-                <w:rFonts w:asciiTheme="minorHAnsi" w:hAnsiTheme="minorHAnsi" w:cstheme="minorHAnsi"/>
-                <w:b/>
-                <w:bCs/>
-                <w:sz w:val="20"/>
-                <w:szCs w:val="20"/>
-              </w:rPr>
-              <w:t>} {</w:t>
-            </w:r>
-            <w:proofErr w:type="spellStart"/>
-            <w:r>
-              <w:rPr>
-                <w:rFonts w:asciiTheme="minorHAnsi" w:hAnsiTheme="minorHAnsi" w:cstheme="minorHAnsi"/>
-                <w:b/>
-                <w:bCs/>
-                <w:sz w:val="20"/>
-                <w:szCs w:val="20"/>
-              </w:rPr>
-              <w:t>consigneeState</w:t>
-            </w:r>
-            <w:proofErr w:type="spellEnd"/>
-            <w:r>
-              <w:rPr>
-                <w:rFonts w:asciiTheme="minorHAnsi" w:hAnsiTheme="minorHAnsi" w:cstheme="minorHAnsi"/>
-                <w:b/>
-                <w:bCs/>
-                <w:sz w:val="20"/>
-                <w:szCs w:val="20"/>
-              </w:rPr>
-              <w:t xml:space="preserve">} </w:t>
-            </w:r>
-          </w:p>
-          <w:p>
-            <w:pPr>
-              <w:ind w:right="227"/>
-              <w:rPr>
-                <w:rFonts w:asciiTheme="minorHAnsi" w:hAnsiTheme="minorHAnsi" w:cstheme="minorHAnsi"/>
-                <w:b/>
-                <w:spacing w:val="-2"/>
-                <w:sz w:val="20"/>
-                <w:szCs w:val="24"/>
-              </w:rPr>
-            </w:pPr>
-            <w:r>
-              <w:rPr>
-                <w:rFonts w:asciiTheme="minorHAnsi" w:hAnsiTheme="minorHAnsi" w:cstheme="minorHAnsi"/>
-                <w:b/>
-                <w:bCs/>
-                <w:sz w:val="20"/>
-                <w:szCs w:val="20"/>
-              </w:rPr>
-              <w:t>{</w:t>
-            </w:r>
-            <w:proofErr w:type="spellStart"/>
-            <w:r>
-              <w:rPr>
-                <w:rFonts w:asciiTheme="minorHAnsi" w:hAnsiTheme="minorHAnsi" w:cstheme="minorHAnsi"/>
-                <w:b/>
-                <w:bCs/>
-                <w:sz w:val="20"/>
-                <w:szCs w:val="20"/>
-              </w:rPr>
-              <w:t>consigneeCountry</w:t>
-            </w:r>
-            <w:proofErr w:type="spellEnd"/>
-            <w:r>
-              <w:rPr>
-                <w:rFonts w:asciiTheme="minorHAnsi" w:hAnsiTheme="minorHAnsi" w:cstheme="minorHAnsi"/>
-                <w:b/>
-                <w:bCs/>
-                <w:sz w:val="20"/>
-                <w:szCs w:val="20"/>
-              </w:rPr>
-              <w:t>} - {</w:t>
-            </w:r>
-            <w:proofErr w:type="spellStart"/>
-            <w:r>
-              <w:rPr>
-                <w:rFonts w:asciiTheme="minorHAnsi" w:hAnsiTheme="minorHAnsi" w:cstheme="minorHAnsi"/>
-                <w:b/>
-                <w:bCs/>
-                <w:sz w:val="20"/>
-                <w:szCs w:val="20"/>
-              </w:rPr>
-              <w:t>consigneeZip</w:t>
-            </w:r>
-            <w:proofErr w:type="spellEnd"/>
-            <w:r>
-              <w:rPr>
-                <w:rFonts w:asciiTheme="minorHAnsi" w:hAnsiTheme="minorHAnsi" w:cstheme="minorHAnsi"/>
-                <w:b/>
-                <w:bCs/>
-                <w:sz w:val="20"/>
-                <w:szCs w:val="20"/>
-              </w:rPr>
-              <w:t>}</w:t>
-            </w:r>
-          </w:p>
-        </w:tc>
-        <w:tc>
-          <w:tcPr>
-            <w:tcW w:w="283" w:type="dxa"/>
-          </w:tcPr>
-          <w:p>
-            <w:pPr>
-              <w:ind w:right="227"/>
-              <w:jc w:val="right"/>
-              <w:rPr>
-                <w:rFonts w:asciiTheme="minorHAnsi" w:hAnsiTheme="minorHAnsi" w:cstheme="minorHAnsi"/>
-                <w:b/>
-                <w:spacing w:val="-2"/>
-                <w:sz w:val="20"/>
-                <w:szCs w:val="24"/>
-              </w:rPr>
-            </w:pPr>
-          </w:p>
-        </w:tc>
-        <w:tc>
-          <w:tcPr>
-            <w:tcW w:w="4536" w:type="dxa"/>
-            <w:gridSpan w:val="5"/>
-          </w:tcPr>
+          </w:p>
           <w:p>
             <w:pPr>
               <w:tabs>
@@ -369,224 +355,23 @@
                 <w:szCs w:val="20"/>
               </w:rPr>
             </w:pPr>
-          </w:p>
-          <w:p>
-            <w:pPr>
-              <w:tabs>
-                <w:tab w:val="left" w:pos="1224"/>
-              </w:tabs>
-              <w:ind w:right="227"/>
-              <w:rPr>
-                <w:rFonts w:asciiTheme="minorHAnsi" w:hAnsiTheme="minorHAnsi" w:cstheme="minorHAnsi"/>
-                <w:b/>
-                <w:bCs/>
-                <w:sz w:val="20"/>
-                <w:szCs w:val="20"/>
-              </w:rPr>
-            </w:pPr>
-            <w:r>
-              <w:rPr>
-                <w:rFonts w:asciiTheme="minorHAnsi" w:hAnsiTheme="minorHAnsi" w:cstheme="minorHAnsi"/>
-                <w:b/>
-                <w:bCs/>
-                <w:sz w:val="20"/>
-                <w:szCs w:val="20"/>
-              </w:rPr>
-              <w:t>{#</w:t>
-            </w:r>
-            <w:proofErr w:type="gramStart"/>
-            <w:r>
-              <w:rPr>
-                <w:rFonts w:asciiTheme="minorHAnsi" w:hAnsiTheme="minorHAnsi" w:cstheme="minorHAnsi"/>
-                <w:b/>
-                <w:bCs/>
-                <w:sz w:val="20"/>
-                <w:szCs w:val="20"/>
-              </w:rPr>
-              <w:t>isUK}Proforma</w:t>
-            </w:r>
-            <w:proofErr w:type="gramEnd"/>
-            <w:r>
-              <w:rPr>
-                <w:rFonts w:asciiTheme="minorHAnsi" w:hAnsiTheme="minorHAnsi" w:cstheme="minorHAnsi"/>
-                <w:b/>
-                <w:bCs/>
-                <w:sz w:val="20"/>
-                <w:szCs w:val="20"/>
-              </w:rPr>
-              <w:t xml:space="preserve"> Invoice{/</w:t>
-            </w:r>
-            <w:proofErr w:type="spellStart"/>
-            <w:proofErr w:type="gramStart"/>
-            <w:r>
-              <w:rPr>
-                <w:rFonts w:asciiTheme="minorHAnsi" w:hAnsiTheme="minorHAnsi" w:cstheme="minorHAnsi"/>
-                <w:b/>
-                <w:bCs/>
-                <w:sz w:val="20"/>
-                <w:szCs w:val="20"/>
-              </w:rPr>
-              <w:t>isUK</w:t>
-            </w:r>
-            <w:proofErr w:type="spellEnd"/>
-            <w:r>
-              <w:rPr>
-                <w:rFonts w:asciiTheme="minorHAnsi" w:hAnsiTheme="minorHAnsi" w:cstheme="minorHAnsi"/>
-                <w:b/>
-                <w:bCs/>
-                <w:sz w:val="20"/>
-                <w:szCs w:val="20"/>
-              </w:rPr>
-              <w:t>}{</w:t>
-            </w:r>
-            <w:proofErr w:type="gramEnd"/>
-            <w:r>
-              <w:rPr>
-                <w:rFonts w:asciiTheme="minorHAnsi" w:hAnsiTheme="minorHAnsi" w:cstheme="minorHAnsi"/>
-                <w:b/>
-                <w:bCs/>
-                <w:sz w:val="20"/>
-                <w:szCs w:val="20"/>
-              </w:rPr>
-              <w:t>#</w:t>
-            </w:r>
-            <w:proofErr w:type="gramStart"/>
-            <w:r>
-              <w:rPr>
-                <w:rFonts w:asciiTheme="minorHAnsi" w:hAnsiTheme="minorHAnsi" w:cstheme="minorHAnsi"/>
-                <w:b/>
-                <w:bCs/>
-                <w:sz w:val="20"/>
-                <w:szCs w:val="20"/>
-              </w:rPr>
-              <w:t>isGen}Order</w:t>
-            </w:r>
-            <w:proofErr w:type="gramEnd"/>
-            <w:r>
-              <w:rPr>
-                <w:rFonts w:asciiTheme="minorHAnsi" w:hAnsiTheme="minorHAnsi" w:cstheme="minorHAnsi"/>
-                <w:b/>
-                <w:bCs/>
-                <w:sz w:val="20"/>
-                <w:szCs w:val="20"/>
-              </w:rPr>
-              <w:t xml:space="preserve"> Confirmation{/</w:t>
-            </w:r>
-            <w:proofErr w:type="spellStart"/>
-            <w:proofErr w:type="gramStart"/>
-            <w:r>
-              <w:rPr>
-                <w:rFonts w:asciiTheme="minorHAnsi" w:hAnsiTheme="minorHAnsi" w:cstheme="minorHAnsi"/>
-                <w:b/>
-                <w:bCs/>
-                <w:sz w:val="20"/>
-                <w:szCs w:val="20"/>
-              </w:rPr>
-              <w:t>isGen</w:t>
-            </w:r>
-            <w:proofErr w:type="spellEnd"/>
-            <w:r>
-              <w:rPr>
-                <w:rFonts w:asciiTheme="minorHAnsi" w:hAnsiTheme="minorHAnsi" w:cstheme="minorHAnsi"/>
-                <w:b/>
-                <w:bCs/>
-                <w:sz w:val="20"/>
-                <w:szCs w:val="20"/>
-              </w:rPr>
-              <w:t>}{</w:t>
-            </w:r>
-            <w:proofErr w:type="gramEnd"/>
-            <w:r>
-              <w:rPr>
-                <w:rFonts w:asciiTheme="minorHAnsi" w:hAnsiTheme="minorHAnsi" w:cstheme="minorHAnsi"/>
-                <w:b/>
-                <w:bCs/>
-                <w:sz w:val="20"/>
-                <w:szCs w:val="20"/>
-              </w:rPr>
-              <w:t>#</w:t>
-            </w:r>
-            <w:proofErr w:type="gramStart"/>
-            <w:r>
-              <w:rPr>
-                <w:rFonts w:asciiTheme="minorHAnsi" w:hAnsiTheme="minorHAnsi" w:cstheme="minorHAnsi"/>
-                <w:b/>
-                <w:bCs/>
-                <w:sz w:val="20"/>
-                <w:szCs w:val="20"/>
-              </w:rPr>
-              <w:t>isAus}Order</w:t>
-            </w:r>
-            <w:proofErr w:type="gramEnd"/>
-            <w:r>
-              <w:rPr>
-                <w:rFonts w:asciiTheme="minorHAnsi" w:hAnsiTheme="minorHAnsi" w:cstheme="minorHAnsi"/>
-                <w:b/>
-                <w:bCs/>
-                <w:sz w:val="20"/>
-                <w:szCs w:val="20"/>
-              </w:rPr>
-              <w:t xml:space="preserve"> Confirmation{/</w:t>
-            </w:r>
-            <w:proofErr w:type="spellStart"/>
-            <w:r>
-              <w:rPr>
-                <w:rFonts w:asciiTheme="minorHAnsi" w:hAnsiTheme="minorHAnsi" w:cstheme="minorHAnsi"/>
-                <w:b/>
-                <w:bCs/>
-                <w:sz w:val="20"/>
-                <w:szCs w:val="20"/>
-              </w:rPr>
-              <w:t>isAus</w:t>
-            </w:r>
-            <w:proofErr w:type="spellEnd"/>
-            <w:proofErr w:type="gramStart"/>
-            <w:r>
-              <w:rPr>
-                <w:rFonts w:asciiTheme="minorHAnsi" w:hAnsiTheme="minorHAnsi" w:cstheme="minorHAnsi"/>
-                <w:b/>
-                <w:bCs/>
-                <w:sz w:val="20"/>
-                <w:szCs w:val="20"/>
-              </w:rPr>
-              <w:t>} :</w:t>
-            </w:r>
-            <w:proofErr w:type="gramEnd"/>
-            <w:r>
-              <w:rPr>
-                <w:rFonts w:asciiTheme="minorHAnsi" w:hAnsiTheme="minorHAnsi" w:cstheme="minorHAnsi"/>
-                <w:b/>
-                <w:bCs/>
-                <w:sz w:val="20"/>
-                <w:szCs w:val="20"/>
-              </w:rPr>
-              <w:t xml:space="preserve"> </w:t>
-            </w:r>
-            <w:r>
-              <w:rPr>
-                <w:rFonts w:asciiTheme="minorHAnsi" w:hAnsiTheme="minorHAnsi" w:cstheme="minorHAnsi"/>
-                <w:sz w:val="20"/>
-                <w:szCs w:val="20"/>
-              </w:rPr>
-              <w:t>{</w:t>
-            </w:r>
-            <w:proofErr w:type="spellStart"/>
-            <w:r>
-              <w:rPr>
-                <w:rFonts w:asciiTheme="minorHAnsi" w:hAnsiTheme="minorHAnsi" w:cstheme="minorHAnsi"/>
-                <w:sz w:val="20"/>
-                <w:szCs w:val="20"/>
-              </w:rPr>
-              <w:t>invoicePiNo</w:t>
-            </w:r>
-            <w:proofErr w:type="spellEnd"/>
-            <w:r>
-              <w:rPr>
-                <w:rFonts w:asciiTheme="minorHAnsi" w:hAnsiTheme="minorHAnsi" w:cstheme="minorHAnsi"/>
-                <w:sz w:val="20"/>
-                <w:szCs w:val="20"/>
-              </w:rPr>
-              <w:t>}</w:t>
+            <w:r>
+              <w:rPr>
+                <w:rFonts w:asciiTheme="minorHAnsi" w:hAnsiTheme="minorHAnsi" w:cstheme="minorHAnsi"/>
+                <w:b/>
+                <w:bCs/>
+                <w:sz w:val="20"/>
+                <w:szCs w:val="20"/>
+              </w:rPr>
+              <w:t xml:space="preserve">{#isUK}Proforma Invoice{/isUK}{#isGen}Order Confirmation{/isGen}{#isAus}Order Confirmation{/isAus} : </w:t>
+            </w:r>
+            <w:r>
+              <w:rPr>
+                <w:rFonts w:asciiTheme="minorHAnsi" w:hAnsiTheme="minorHAnsi" w:cstheme="minorHAnsi"/>
+                <w:sz w:val="20"/>
+                <w:szCs w:val="20"/>
+              </w:rPr>
+              <w:t>{invoicePiNo}</w:t>
             </w:r>
           </w:p>
           <w:p>
@@ -756,7 +541,6 @@
                 </mc:Fallback>
               </mc:AlternateContent>
             </w:r>
-            <w:proofErr w:type="gramStart"/>
             <w:r>
               <w:rPr>
                 <w:rFonts w:asciiTheme="minorHAnsi" w:hAnsiTheme="minorHAnsi" w:cstheme="minorHAnsi"/>
@@ -780,17 +564,16 @@
                 <w:spacing w:val="-10"/>
                 <w:sz w:val="20"/>
               </w:rPr>
-              <w:t>:</w:t>
-            </w:r>
-            <w:proofErr w:type="gramEnd"/>
-            <w:r>
-              <w:rPr>
-                <w:rFonts w:asciiTheme="minorHAnsi" w:hAnsiTheme="minorHAnsi" w:cstheme="minorHAnsi"/>
-                <w:b/>
+              <w:t xml:space="preserve">: </w:t>
+            </w:r>
+            <w:r>
+              <w:rPr>
+                <w:rFonts w:asciiTheme="minorHAnsi" w:hAnsiTheme="minorHAnsi" w:cstheme="minorHAnsi"/>
+                <w:bCs/>
                 <w:spacing w:val="-10"/>
                 <w:sz w:val="20"/>
               </w:rPr>
-              <w:t xml:space="preserve"> </w:t>
+              <w:t>{</w:t>
             </w:r>
             <w:r>
               <w:rPr>
@@ -798,21 +581,10 @@
                 <w:bCs/>
                 <w:spacing w:val="-10"/>
                 <w:sz w:val="20"/>
-              </w:rPr>
-              <w:t>{</w:t>
-            </w:r>
-            <w:proofErr w:type="spellStart"/>
-            <w:r>
-              <w:rPr>
-                <w:rFonts w:asciiTheme="minorHAnsi" w:hAnsiTheme="minorHAnsi" w:cstheme="minorHAnsi"/>
-                <w:bCs/>
-                <w:spacing w:val="-10"/>
-                <w:sz w:val="20"/>
                 <w:lang w:val="en-IN"/>
               </w:rPr>
               <w:t>orderDate</w:t>
             </w:r>
-            <w:proofErr w:type="spellEnd"/>
             <w:r>
               <w:rPr>
                 <w:rFonts w:asciiTheme="minorHAnsi" w:hAnsiTheme="minorHAnsi" w:cstheme="minorHAnsi"/>
@@ -902,8 +674,6 @@
               </w:rPr>
               <w:t>{#</w:t>
             </w:r>
-            <w:proofErr w:type="spellStart"/>
-            <w:proofErr w:type="gramStart"/>
             <w:r>
               <w:rPr>
                 <w:rFonts w:asciiTheme="minorHAnsi" w:hAnsiTheme="minorHAnsi" w:cstheme="minorHAnsi"/>
@@ -915,64 +685,16 @@
               </w:rPr>
               <w:t>isUK</w:t>
             </w:r>
-            <w:proofErr w:type="spellEnd"/>
-            <w:r>
-              <w:rPr>
-                <w:rFonts w:asciiTheme="minorHAnsi" w:hAnsiTheme="minorHAnsi" w:cstheme="minorHAnsi"/>
-                <w:b/>
-                <w:bCs/>
-                <w:sz w:val="20"/>
-                <w:szCs w:val="20"/>
-              </w:rPr>
-              <w:t>}NOTIFY</w:t>
-            </w:r>
-            <w:proofErr w:type="gramEnd"/>
-            <w:r>
-              <w:rPr>
-                <w:rFonts w:asciiTheme="minorHAnsi" w:hAnsiTheme="minorHAnsi" w:cstheme="minorHAnsi"/>
-                <w:b/>
-                <w:bCs/>
-                <w:sz w:val="20"/>
-                <w:szCs w:val="20"/>
-              </w:rPr>
-              <w:t>-{/</w:t>
-            </w:r>
-            <w:proofErr w:type="spellStart"/>
-            <w:proofErr w:type="gramStart"/>
-            <w:r>
-              <w:rPr>
-                <w:rFonts w:asciiTheme="minorHAnsi" w:hAnsiTheme="minorHAnsi" w:cstheme="minorHAnsi"/>
-                <w:b/>
-                <w:bCs/>
-                <w:sz w:val="20"/>
-                <w:szCs w:val="20"/>
-              </w:rPr>
-              <w:t>isUK</w:t>
-            </w:r>
-            <w:proofErr w:type="spellEnd"/>
-            <w:r>
-              <w:rPr>
-                <w:rFonts w:asciiTheme="minorHAnsi" w:hAnsiTheme="minorHAnsi" w:cstheme="minorHAnsi"/>
-                <w:b/>
-                <w:bCs/>
-                <w:sz w:val="20"/>
-                <w:szCs w:val="20"/>
-              </w:rPr>
-              <w:t>}{</w:t>
-            </w:r>
-            <w:proofErr w:type="gramEnd"/>
-            <w:r>
-              <w:rPr>
-                <w:rFonts w:asciiTheme="minorHAnsi" w:hAnsiTheme="minorHAnsi" w:cstheme="minorHAnsi"/>
-                <w:b/>
-                <w:bCs/>
-                <w:sz w:val="20"/>
-                <w:szCs w:val="20"/>
-              </w:rPr>
-              <w:t>#</w:t>
-            </w:r>
-            <w:proofErr w:type="spellStart"/>
-            <w:proofErr w:type="gramStart"/>
+            <w:r>
+              <w:rPr>
+                <w:rFonts w:asciiTheme="minorHAnsi" w:hAnsiTheme="minorHAnsi" w:cstheme="minorHAnsi"/>
+                <w:b/>
+                <w:bCs/>
+                <w:sz w:val="20"/>
+                <w:szCs w:val="20"/>
+              </w:rPr>
+              <w:t>}NOTIFY-{/isUK}{#</w:t>
+            </w:r>
             <w:r>
               <w:rPr>
                 <w:rFonts w:asciiTheme="minorHAnsi" w:hAnsiTheme="minorHAnsi" w:cstheme="minorHAnsi"/>
@@ -984,73 +706,15 @@
               </w:rPr>
               <w:t>isAus</w:t>
             </w:r>
-            <w:proofErr w:type="spellEnd"/>
-            <w:r>
-              <w:rPr>
-                <w:rFonts w:asciiTheme="minorHAnsi" w:hAnsiTheme="minorHAnsi" w:cstheme="minorHAnsi"/>
-                <w:b/>
-                <w:bCs/>
-                <w:sz w:val="20"/>
-                <w:szCs w:val="20"/>
-              </w:rPr>
-              <w:t>}DELIVERED</w:t>
-            </w:r>
-            <w:proofErr w:type="gramEnd"/>
-            <w:r>
-              <w:rPr>
-                <w:rFonts w:asciiTheme="minorHAnsi" w:hAnsiTheme="minorHAnsi" w:cstheme="minorHAnsi"/>
-                <w:b/>
-                <w:bCs/>
-                <w:sz w:val="20"/>
-                <w:szCs w:val="20"/>
-              </w:rPr>
-              <w:t xml:space="preserve"> TO-{/</w:t>
-            </w:r>
-            <w:proofErr w:type="spellStart"/>
-            <w:proofErr w:type="gramStart"/>
-            <w:r>
-              <w:rPr>
-                <w:rFonts w:asciiTheme="minorHAnsi" w:hAnsiTheme="minorHAnsi" w:cstheme="minorHAnsi"/>
-                <w:b/>
-                <w:bCs/>
-                <w:sz w:val="20"/>
-                <w:szCs w:val="20"/>
-              </w:rPr>
-              <w:t>isAus</w:t>
-            </w:r>
-            <w:proofErr w:type="spellEnd"/>
-            <w:r>
-              <w:rPr>
-                <w:rFonts w:asciiTheme="minorHAnsi" w:hAnsiTheme="minorHAnsi" w:cstheme="minorHAnsi"/>
-                <w:b/>
-                <w:bCs/>
-                <w:sz w:val="20"/>
-                <w:szCs w:val="20"/>
-              </w:rPr>
-              <w:t>}{</w:t>
-            </w:r>
-            <w:proofErr w:type="spellStart"/>
-            <w:proofErr w:type="gramEnd"/>
-            <w:r>
-              <w:rPr>
-                <w:rFonts w:asciiTheme="minorHAnsi" w:hAnsiTheme="minorHAnsi" w:cstheme="minorHAnsi"/>
-                <w:b/>
-                <w:bCs/>
-                <w:sz w:val="20"/>
-                <w:szCs w:val="20"/>
-              </w:rPr>
-              <w:t>buyerName</w:t>
-            </w:r>
-            <w:proofErr w:type="spellEnd"/>
-            <w:r>
-              <w:rPr>
-                <w:rFonts w:asciiTheme="minorHAnsi" w:hAnsiTheme="minorHAnsi" w:cstheme="minorHAnsi"/>
-                <w:b/>
-                <w:bCs/>
-                <w:sz w:val="20"/>
-                <w:szCs w:val="20"/>
-              </w:rPr>
-              <w:t>}</w:t>
+            <w:r>
+              <w:rPr>
+                <w:rFonts w:asciiTheme="minorHAnsi" w:hAnsiTheme="minorHAnsi" w:cstheme="minorHAnsi"/>
+                <w:b/>
+                <w:bCs/>
+                <w:sz w:val="20"/>
+                <w:szCs w:val="20"/>
+              </w:rPr>
+              <w:t>}DELIVERED TO-{/isAus}{buyerName}</w:t>
             </w:r>
           </w:p>
           <w:p>
@@ -1075,29 +739,7 @@
                 <w:sz w:val="20"/>
                 <w:szCs w:val="20"/>
               </w:rPr>
-              <w:t>{</w:t>
-            </w:r>
-            <w:proofErr w:type="spellStart"/>
-            <w:r>
-              <w:rPr>
-                <w:rFonts w:asciiTheme="minorHAnsi" w:hAnsiTheme="minorHAnsi" w:cstheme="minorHAnsi"/>
-                <w:b/>
-                <w:bCs/>
-                <w:sz w:val="20"/>
-                <w:szCs w:val="20"/>
-              </w:rPr>
-              <w:t>buyerAddress</w:t>
-            </w:r>
-            <w:proofErr w:type="spellEnd"/>
-            <w:r>
-              <w:rPr>
-                <w:rFonts w:asciiTheme="minorHAnsi" w:hAnsiTheme="minorHAnsi" w:cstheme="minorHAnsi"/>
-                <w:b/>
-                <w:bCs/>
-                <w:sz w:val="20"/>
-                <w:szCs w:val="20"/>
-              </w:rPr>
-              <w:t>}</w:t>
+              <w:t>{buyerAddress}</w:t>
             </w:r>
           </w:p>
           <w:p>
@@ -1122,42 +764,50 @@
                 <w:sz w:val="20"/>
                 <w:szCs w:val="20"/>
               </w:rPr>
-              <w:t>{</w:t>
-            </w:r>
-            <w:proofErr w:type="spellStart"/>
-            <w:r>
-              <w:rPr>
-                <w:rFonts w:asciiTheme="minorHAnsi" w:hAnsiTheme="minorHAnsi" w:cstheme="minorHAnsi"/>
-                <w:b/>
-                <w:bCs/>
-                <w:sz w:val="20"/>
-                <w:szCs w:val="20"/>
-              </w:rPr>
-              <w:t>buyerCity</w:t>
-            </w:r>
-            <w:proofErr w:type="spellEnd"/>
-            <w:r>
-              <w:rPr>
-                <w:rFonts w:asciiTheme="minorHAnsi" w:hAnsiTheme="minorHAnsi" w:cstheme="minorHAnsi"/>
-                <w:b/>
-                <w:bCs/>
-                <w:sz w:val="20"/>
-                <w:szCs w:val="20"/>
-              </w:rPr>
-              <w:t>} {</w:t>
-            </w:r>
-            <w:proofErr w:type="spellStart"/>
-            <w:r>
-              <w:rPr>
-                <w:rFonts w:asciiTheme="minorHAnsi" w:hAnsiTheme="minorHAnsi" w:cstheme="minorHAnsi"/>
-                <w:b/>
-                <w:bCs/>
-                <w:sz w:val="20"/>
-                <w:szCs w:val="20"/>
-              </w:rPr>
-              <w:t>buyerState</w:t>
-            </w:r>
-            <w:proofErr w:type="spellEnd"/>
+              <w:t>{buyerCity} {buyerState}</w:t>
+            </w:r>
+          </w:p>
+          <w:p>
+            <w:pPr>
+              <w:ind w:right="227"/>
+              <w:rPr>
+                <w:rFonts w:asciiTheme="minorHAnsi" w:hAnsiTheme="minorHAnsi" w:cstheme="minorHAnsi"/>
+                <w:b/>
+                <w:spacing w:val="-2"/>
+                <w:sz w:val="20"/>
+                <w:szCs w:val="24"/>
+              </w:rPr>
+            </w:pPr>
+            <w:r>
+              <w:rPr>
+                <w:rFonts w:asciiTheme="minorHAnsi" w:hAnsiTheme="minorHAnsi" w:cstheme="minorHAnsi"/>
+                <w:b/>
+                <w:bCs/>
+                <w:sz w:val="20"/>
+                <w:szCs w:val="20"/>
+              </w:rPr>
+              <w:t xml:space="preserve">{buyerCountry} </w:t>
+            </w:r>
+            <w:r>
+              <w:rPr>
+                <w:rFonts w:asciiTheme="minorHAnsi" w:hAnsiTheme="minorHAnsi" w:cstheme="minorHAnsi"/>
+                <w:b/>
+                <w:bCs/>
+                <w:sz w:val="20"/>
+                <w:szCs w:val="20"/>
+              </w:rPr>
+              <w:t>{#</w:t>
+            </w:r>
+            <w:r>
+              <w:rPr>
+                <w:rFonts w:asciiTheme="minorHAnsi" w:hAnsiTheme="minorHAnsi" w:cstheme="minorHAnsi"/>
+                <w:b/>
+                <w:bCs/>
+                <w:sz w:val="20"/>
+                <w:szCs w:val="20"/>
+              </w:rPr>
+              <w:t>buyerZip</w:t>
+            </w:r>
             <w:r>
               <w:rPr>
                 <w:rFonts w:asciiTheme="minorHAnsi" w:hAnsiTheme="minorHAnsi" w:cstheme="minorHAnsi"/>
@@ -1168,59 +818,25 @@
               </w:rPr>
               <w:t>}</w:t>
             </w:r>
-          </w:p>
-          <w:p>
-            <w:pPr>
-              <w:ind w:right="227"/>
-              <w:rPr>
-                <w:rFonts w:asciiTheme="minorHAnsi" w:hAnsiTheme="minorHAnsi" w:cstheme="minorHAnsi"/>
-                <w:b/>
-                <w:spacing w:val="-2"/>
-                <w:sz w:val="20"/>
-                <w:szCs w:val="24"/>
-              </w:rPr>
-            </w:pPr>
-            <w:r>
-              <w:rPr>
-                <w:rFonts w:asciiTheme="minorHAnsi" w:hAnsiTheme="minorHAnsi" w:cstheme="minorHAnsi"/>
-                <w:b/>
-                <w:bCs/>
-                <w:sz w:val="20"/>
-                <w:szCs w:val="20"/>
-              </w:rPr>
-              <w:t>{</w:t>
-            </w:r>
-            <w:proofErr w:type="spellStart"/>
-            <w:r>
-              <w:rPr>
-                <w:rFonts w:asciiTheme="minorHAnsi" w:hAnsiTheme="minorHAnsi" w:cstheme="minorHAnsi"/>
-                <w:b/>
-                <w:bCs/>
-                <w:sz w:val="20"/>
-                <w:szCs w:val="20"/>
-              </w:rPr>
-              <w:t>buyerCountry</w:t>
-            </w:r>
-            <w:proofErr w:type="spellEnd"/>
-            <w:r>
-              <w:rPr>
-                <w:rFonts w:asciiTheme="minorHAnsi" w:hAnsiTheme="minorHAnsi" w:cstheme="minorHAnsi"/>
-                <w:b/>
-                <w:bCs/>
-                <w:sz w:val="20"/>
-                <w:szCs w:val="20"/>
-              </w:rPr>
-              <w:t xml:space="preserve">} </w:t>
-            </w:r>
-            <w:r>
-              <w:rPr>
-                <w:rFonts w:asciiTheme="minorHAnsi" w:hAnsiTheme="minorHAnsi" w:cstheme="minorHAnsi"/>
-                <w:b/>
-                <w:bCs/>
-                <w:sz w:val="20"/>
-                <w:szCs w:val="20"/>
-              </w:rPr>
-              <w:t>{#</w:t>
+            <w:r>
+              <w:rPr>
+                <w:rFonts w:asciiTheme="minorHAnsi" w:hAnsiTheme="minorHAnsi" w:cstheme="minorHAnsi"/>
+                <w:b/>
+                <w:bCs/>
+                <w:sz w:val="20"/>
+                <w:szCs w:val="20"/>
+              </w:rPr>
+              <w:t>- {buyerZip}</w:t>
+            </w:r>
+            <w:r>
+              <w:rPr>
+                <w:rFonts w:asciiTheme="minorHAnsi" w:hAnsiTheme="minorHAnsi" w:cstheme="minorHAnsi"/>
+                <w:b/>
+                <w:bCs/>
+                <w:sz w:val="20"/>
+                <w:szCs w:val="20"/>
+              </w:rPr>
+              <w:t>{/</w:t>
             </w:r>
             <w:r>
               <w:rPr>
@@ -1232,70 +848,6 @@
               </w:rPr>
               <w:t>buyerZip</w:t>
             </w:r>
-            <w:r>
-              <w:rPr>
-                <w:rFonts w:asciiTheme="minorHAnsi" w:hAnsiTheme="minorHAnsi" w:cstheme="minorHAnsi"/>
-                <w:b/>
-                <w:bCs/>
-                <w:sz w:val="20"/>
-                <w:szCs w:val="20"/>
-              </w:rPr>
-              <w:t>}</w:t>
-            </w:r>
-            <w:r>
-              <w:rPr>
-                <w:rFonts w:asciiTheme="minorHAnsi" w:hAnsiTheme="minorHAnsi" w:cstheme="minorHAnsi"/>
-                <w:b/>
-                <w:bCs/>
-                <w:sz w:val="20"/>
-                <w:szCs w:val="20"/>
-              </w:rPr>
-              <w:t>- {</w:t>
-            </w:r>
-            <w:proofErr w:type="spellStart"/>
-            <w:r>
-              <w:rPr>
-                <w:rFonts w:asciiTheme="minorHAnsi" w:hAnsiTheme="minorHAnsi" w:cstheme="minorHAnsi"/>
-                <w:b/>
-                <w:bCs/>
-                <w:sz w:val="20"/>
-                <w:szCs w:val="20"/>
-              </w:rPr>
-              <w:t>buyerZip</w:t>
-            </w:r>
-            <w:proofErr w:type="spellEnd"/>
-            <w:r>
-              <w:rPr>
-                <w:rFonts w:asciiTheme="minorHAnsi" w:hAnsiTheme="minorHAnsi" w:cstheme="minorHAnsi"/>
-                <w:b/>
-                <w:bCs/>
-                <w:sz w:val="20"/>
-                <w:szCs w:val="20"/>
-              </w:rPr>
-              <w:t>}</w:t>
-            </w:r>
-            <w:r>
-              <w:rPr>
-                <w:rFonts w:asciiTheme="minorHAnsi" w:hAnsiTheme="minorHAnsi" w:cstheme="minorHAnsi"/>
-                <w:b/>
-                <w:bCs/>
-                <w:sz w:val="20"/>
-                <w:szCs w:val="20"/>
-              </w:rPr>
-              <w:t>{/</w:t>
-            </w:r>
-            <w:proofErr w:type="spellStart"/>
-            <w:r>
-              <w:rPr>
-                <w:rFonts w:asciiTheme="minorHAnsi" w:hAnsiTheme="minorHAnsi" w:cstheme="minorHAnsi"/>
-                <w:b/>
-                <w:bCs/>
-                <w:sz w:val="20"/>
-                <w:szCs w:val="20"/>
-              </w:rPr>
-              <w:t>buyerZip</w:t>
-            </w:r>
-            <w:proofErr w:type="spellEnd"/>
             <w:r>
               <w:rPr>
                 <w:rFonts w:asciiTheme="minorHAnsi" w:hAnsiTheme="minorHAnsi" w:cstheme="minorHAnsi"/>
@@ -1487,9 +1039,8 @@
                 <w:sz w:val="20"/>
                 <w:szCs w:val="24"/>
               </w:rPr>
-              <w:t>{#</w:t>
-            </w:r>
-            <w:proofErr w:type="gramStart"/>
+              <w:t>{#isAus}ASW No{/isAus}{</w:t>
+            </w:r>
             <w:r>
               <w:rPr>
                 <w:rFonts w:asciiTheme="minorHAnsi" w:hAnsiTheme="minorHAnsi" w:cstheme="minorHAnsi"/>
@@ -1498,9 +1049,8 @@
                 <w:sz w:val="20"/>
                 <w:szCs w:val="24"/>
               </w:rPr>
-              <w:t>isAus}ASW</w:t>
-            </w:r>
-            <w:proofErr w:type="gramEnd"/>
+              <w:t>^</w:t>
+            </w:r>
             <w:r>
               <w:rPr>
                 <w:rFonts w:asciiTheme="minorHAnsi" w:hAnsiTheme="minorHAnsi" w:cstheme="minorHAnsi"/>
@@ -1509,10 +1059,8 @@
                 <w:sz w:val="20"/>
                 <w:szCs w:val="24"/>
               </w:rPr>
-              <w:t xml:space="preserve"> No{/</w:t>
-            </w:r>
-            <w:proofErr w:type="spellStart"/>
-            <w:proofErr w:type="gramStart"/>
+              <w:t>isAus</w:t>
+            </w:r>
             <w:r>
               <w:rPr>
                 <w:rFonts w:asciiTheme="minorHAnsi" w:hAnsiTheme="minorHAnsi" w:cstheme="minorHAnsi"/>
@@ -1521,86 +1069,38 @@
                 <w:sz w:val="20"/>
                 <w:szCs w:val="24"/>
               </w:rPr>
+              <w:t>}</w:t>
+            </w:r>
+            <w:r>
+              <w:rPr>
+                <w:rFonts w:asciiTheme="minorHAnsi" w:hAnsiTheme="minorHAnsi" w:cstheme="minorHAnsi"/>
+                <w:b/>
+                <w:spacing w:val="-4"/>
+                <w:sz w:val="20"/>
+                <w:szCs w:val="24"/>
+              </w:rPr>
+              <w:t>Code</w:t>
+            </w:r>
+            <w:r>
+              <w:rPr>
+                <w:rFonts w:asciiTheme="minorHAnsi" w:hAnsiTheme="minorHAnsi" w:cstheme="minorHAnsi"/>
+                <w:b/>
+                <w:bCs/>
+                <w:sz w:val="20"/>
+                <w:szCs w:val="24"/>
+              </w:rPr>
+              <w:t>{/</w:t>
+            </w:r>
+            <w:r>
+              <w:rPr>
+                <w:rFonts w:asciiTheme="minorHAnsi" w:hAnsiTheme="minorHAnsi" w:cstheme="minorHAnsi"/>
+                <w:b/>
+                <w:bCs/>
+                <w:sz w:val="20"/>
+                <w:szCs w:val="24"/>
+              </w:rPr>
               <w:t>isAus</w:t>
             </w:r>
-            <w:proofErr w:type="spellEnd"/>
-            <w:r>
-              <w:rPr>
-                <w:rFonts w:asciiTheme="minorHAnsi" w:hAnsiTheme="minorHAnsi" w:cstheme="minorHAnsi"/>
-                <w:b/>
-                <w:bCs/>
-                <w:sz w:val="20"/>
-                <w:szCs w:val="24"/>
-              </w:rPr>
-              <w:t>}{</w:t>
-            </w:r>
-            <w:proofErr w:type="gramEnd"/>
-            <w:r>
-              <w:rPr>
-                <w:rFonts w:asciiTheme="minorHAnsi" w:hAnsiTheme="minorHAnsi" w:cstheme="minorHAnsi"/>
-                <w:b/>
-                <w:bCs/>
-                <w:sz w:val="20"/>
-                <w:szCs w:val="24"/>
-              </w:rPr>
-              <w:t>^</w:t>
-            </w:r>
-            <w:proofErr w:type="spellStart"/>
-            <w:proofErr w:type="gramStart"/>
-            <w:r>
-              <w:rPr>
-                <w:rFonts w:asciiTheme="minorHAnsi" w:hAnsiTheme="minorHAnsi" w:cstheme="minorHAnsi"/>
-                <w:b/>
-                <w:bCs/>
-                <w:sz w:val="20"/>
-                <w:szCs w:val="24"/>
-              </w:rPr>
-              <w:t>isAus</w:t>
-            </w:r>
-            <w:proofErr w:type="spellEnd"/>
-            <w:r>
-              <w:rPr>
-                <w:rFonts w:asciiTheme="minorHAnsi" w:hAnsiTheme="minorHAnsi" w:cstheme="minorHAnsi"/>
-                <w:b/>
-                <w:bCs/>
-                <w:sz w:val="20"/>
-                <w:szCs w:val="24"/>
-              </w:rPr>
-              <w:t>}</w:t>
-            </w:r>
-            <w:r>
-              <w:rPr>
-                <w:rFonts w:asciiTheme="minorHAnsi" w:hAnsiTheme="minorHAnsi" w:cstheme="minorHAnsi"/>
-                <w:b/>
-                <w:spacing w:val="-4"/>
-                <w:sz w:val="20"/>
-                <w:szCs w:val="24"/>
-              </w:rPr>
-              <w:t>Code</w:t>
-            </w:r>
-            <w:proofErr w:type="gramEnd"/>
-            <w:r>
-              <w:rPr>
-                <w:rFonts w:asciiTheme="minorHAnsi" w:hAnsiTheme="minorHAnsi" w:cstheme="minorHAnsi"/>
-                <w:b/>
-                <w:bCs/>
-                <w:sz w:val="20"/>
-                <w:szCs w:val="24"/>
-              </w:rPr>
-              <w:t>{/</w:t>
-            </w:r>
-            <w:proofErr w:type="spellStart"/>
-            <w:r>
-              <w:rPr>
-                <w:rFonts w:asciiTheme="minorHAnsi" w:hAnsiTheme="minorHAnsi" w:cstheme="minorHAnsi"/>
-                <w:b/>
-                <w:bCs/>
-                <w:sz w:val="20"/>
-                <w:szCs w:val="24"/>
-              </w:rPr>
-              <w:t>isAus</w:t>
-            </w:r>
-            <w:proofErr w:type="spellEnd"/>
             <w:r>
               <w:rPr>
                 <w:rFonts w:asciiTheme="minorHAnsi" w:hAnsiTheme="minorHAnsi" w:cstheme="minorHAnsi"/>
@@ -1635,75 +1135,7 @@
                 <w:sz w:val="20"/>
                 <w:szCs w:val="24"/>
               </w:rPr>
-              <w:t>{#</w:t>
-            </w:r>
-            <w:proofErr w:type="gramStart"/>
-            <w:r>
-              <w:rPr>
-                <w:rFonts w:asciiTheme="minorHAnsi" w:hAnsiTheme="minorHAnsi" w:cstheme="minorHAnsi"/>
-                <w:b/>
-                <w:bCs/>
-                <w:sz w:val="20"/>
-                <w:szCs w:val="24"/>
-              </w:rPr>
-              <w:t>isAus}ASW</w:t>
-            </w:r>
-            <w:proofErr w:type="gramEnd"/>
-            <w:r>
-              <w:rPr>
-                <w:rFonts w:asciiTheme="minorHAnsi" w:hAnsiTheme="minorHAnsi" w:cstheme="minorHAnsi"/>
-                <w:b/>
-                <w:bCs/>
-                <w:sz w:val="20"/>
-                <w:szCs w:val="24"/>
-              </w:rPr>
-              <w:t xml:space="preserve"> </w:t>
-            </w:r>
-            <w:proofErr w:type="spellStart"/>
-            <w:proofErr w:type="gramStart"/>
-            <w:r>
-              <w:rPr>
-                <w:rFonts w:asciiTheme="minorHAnsi" w:hAnsiTheme="minorHAnsi" w:cstheme="minorHAnsi"/>
-                <w:b/>
-                <w:bCs/>
-                <w:sz w:val="20"/>
-                <w:szCs w:val="24"/>
-              </w:rPr>
-              <w:t>PO.No</w:t>
-            </w:r>
-            <w:proofErr w:type="spellEnd"/>
-            <w:proofErr w:type="gramEnd"/>
-            <w:r>
-              <w:rPr>
-                <w:rFonts w:asciiTheme="minorHAnsi" w:hAnsiTheme="minorHAnsi" w:cstheme="minorHAnsi"/>
-                <w:b/>
-                <w:bCs/>
-                <w:sz w:val="20"/>
-                <w:szCs w:val="24"/>
-              </w:rPr>
-              <w:t>{/</w:t>
-            </w:r>
-            <w:proofErr w:type="spellStart"/>
-            <w:r>
-              <w:rPr>
-                <w:rFonts w:asciiTheme="minorHAnsi" w:hAnsiTheme="minorHAnsi" w:cstheme="minorHAnsi"/>
-                <w:b/>
-                <w:bCs/>
-                <w:sz w:val="20"/>
-                <w:szCs w:val="24"/>
-              </w:rPr>
-              <w:t>isAus</w:t>
-            </w:r>
-            <w:proofErr w:type="spellEnd"/>
-            <w:r>
-              <w:rPr>
-                <w:rFonts w:asciiTheme="minorHAnsi" w:hAnsiTheme="minorHAnsi" w:cstheme="minorHAnsi"/>
-                <w:b/>
-                <w:bCs/>
-                <w:sz w:val="20"/>
-                <w:szCs w:val="24"/>
-              </w:rPr>
-              <w:t>}</w:t>
+              <w:t>{#isAus}ASW PO.No{/isAus}</w:t>
             </w:r>
           </w:p>
         </w:tc>
@@ -1833,29 +1265,7 @@
                 <w:sz w:val="20"/>
                 <w:szCs w:val="24"/>
               </w:rPr>
-              <w:t>{</w:t>
-            </w:r>
-            <w:proofErr w:type="spellStart"/>
-            <w:r>
-              <w:rPr>
-                <w:rFonts w:asciiTheme="minorHAnsi" w:hAnsiTheme="minorHAnsi" w:cstheme="minorHAnsi"/>
-                <w:b/>
-                <w:bCs/>
-                <w:sz w:val="20"/>
-                <w:szCs w:val="24"/>
-              </w:rPr>
-              <w:t>currencyChar</w:t>
-            </w:r>
-            <w:proofErr w:type="spellEnd"/>
-            <w:r>
-              <w:rPr>
-                <w:rFonts w:asciiTheme="minorHAnsi" w:hAnsiTheme="minorHAnsi" w:cstheme="minorHAnsi"/>
-                <w:b/>
-                <w:bCs/>
-                <w:sz w:val="20"/>
-                <w:szCs w:val="24"/>
-              </w:rPr>
-              <w:t>}</w:t>
+              <w:t>{currencyChar}</w:t>
             </w:r>
           </w:p>
         </w:tc>
@@ -1906,29 +1316,7 @@
                 <w:sz w:val="20"/>
                 <w:szCs w:val="24"/>
               </w:rPr>
-              <w:t>{</w:t>
-            </w:r>
-            <w:proofErr w:type="spellStart"/>
-            <w:r>
-              <w:rPr>
-                <w:rFonts w:asciiTheme="minorHAnsi" w:hAnsiTheme="minorHAnsi" w:cstheme="minorHAnsi"/>
-                <w:b/>
-                <w:bCs/>
-                <w:sz w:val="20"/>
-                <w:szCs w:val="24"/>
-              </w:rPr>
-              <w:t>currencyChar</w:t>
-            </w:r>
-            <w:proofErr w:type="spellEnd"/>
-            <w:r>
-              <w:rPr>
-                <w:rFonts w:asciiTheme="minorHAnsi" w:hAnsiTheme="minorHAnsi" w:cstheme="minorHAnsi"/>
-                <w:b/>
-                <w:bCs/>
-                <w:sz w:val="20"/>
-                <w:szCs w:val="24"/>
-              </w:rPr>
-              <w:t>}</w:t>
+              <w:t>{currencyChar}</w:t>
             </w:r>
           </w:p>
         </w:tc>
@@ -1960,8 +1348,6 @@
               </w:rPr>
               <w:t>{#</w:t>
             </w:r>
-            <w:proofErr w:type="spellStart"/>
-            <w:proofErr w:type="gramStart"/>
             <w:r>
               <w:rPr>
                 <w:rFonts w:asciiTheme="minorHAnsi" w:hAnsiTheme="minorHAnsi" w:cstheme="minorHAnsi"/>
@@ -1971,53 +1357,23 @@
               </w:rPr>
               <w:t>OCItems</w:t>
             </w:r>
-            <w:proofErr w:type="spellEnd"/>
-            <w:r>
-              <w:rPr>
-                <w:rFonts w:asciiTheme="minorHAnsi" w:hAnsiTheme="minorHAnsi" w:cstheme="minorHAnsi"/>
-                <w:sz w:val="20"/>
-                <w:szCs w:val="20"/>
-              </w:rPr>
-              <w:t>}{</w:t>
-            </w:r>
-            <w:proofErr w:type="gramEnd"/>
-            <w:r>
-              <w:rPr>
-                <w:rFonts w:asciiTheme="minorHAnsi" w:hAnsiTheme="minorHAnsi" w:cstheme="minorHAnsi"/>
-                <w:sz w:val="20"/>
-                <w:szCs w:val="20"/>
-              </w:rPr>
-              <w:t>#</w:t>
-            </w:r>
-            <w:proofErr w:type="gramStart"/>
-            <w:r>
-              <w:rPr>
-                <w:rFonts w:asciiTheme="minorHAnsi" w:hAnsiTheme="minorHAnsi" w:cstheme="minorHAnsi"/>
-                <w:sz w:val="20"/>
-                <w:szCs w:val="20"/>
-              </w:rPr>
-              <w:t>showThickness}</w:t>
-            </w:r>
-            <w:r>
-              <w:rPr>
-                <w:rFonts w:asciiTheme="minorHAnsi" w:hAnsiTheme="minorHAnsi" w:cstheme="minorHAnsi"/>
-                <w:b/>
-                <w:bCs/>
-                <w:sz w:val="20"/>
-                <w:szCs w:val="20"/>
-              </w:rPr>
-              <w:t>{</w:t>
-            </w:r>
-            <w:proofErr w:type="gramEnd"/>
-            <w:r>
-              <w:rPr>
-                <w:rFonts w:asciiTheme="minorHAnsi" w:hAnsiTheme="minorHAnsi" w:cstheme="minorHAnsi"/>
-                <w:b/>
-                <w:bCs/>
-                <w:sz w:val="20"/>
-                <w:szCs w:val="20"/>
-              </w:rPr>
-              <w:t>thicknessDetail}</w:t>
+            <w:r>
+              <w:rPr>
+                <w:rFonts w:asciiTheme="minorHAnsi" w:hAnsiTheme="minorHAnsi" w:cstheme="minorHAnsi"/>
+                <w:sz w:val="20"/>
+                <w:szCs w:val="20"/>
+              </w:rPr>
+              <w:t>}{#showThickness}</w:t>
+            </w:r>
+            <w:r>
+              <w:rPr>
+                <w:rFonts w:asciiTheme="minorHAnsi" w:hAnsiTheme="minorHAnsi" w:cstheme="minorHAnsi"/>
+                <w:b/>
+                <w:bCs/>
+                <w:sz w:val="20"/>
+                <w:szCs w:val="20"/>
+              </w:rPr>
+              <w:t>{thicknessDetail}</w:t>
             </w:r>
             <w:r>
               <w:rPr>
@@ -2144,7 +1500,6 @@
               </w:rPr>
               <w:t>{#</w:t>
             </w:r>
-            <w:proofErr w:type="spellStart"/>
             <w:r>
               <w:rPr>
                 <w:rFonts w:asciiTheme="minorHAnsi" w:hAnsiTheme="minorHAnsi" w:cstheme="minorHAnsi"/>
@@ -2156,7 +1511,6 @@
               </w:rPr>
               <w:t>extNotes</w:t>
             </w:r>
-            <w:proofErr w:type="spellEnd"/>
             <w:r>
               <w:rPr>
                 <w:rFonts w:asciiTheme="minorHAnsi" w:hAnsiTheme="minorHAnsi" w:cstheme="minorHAnsi"/>
@@ -2167,7 +1521,6 @@
               </w:rPr>
               <w:t>} - {</w:t>
             </w:r>
-            <w:proofErr w:type="spellStart"/>
             <w:r>
               <w:rPr>
                 <w:rFonts w:asciiTheme="minorHAnsi" w:hAnsiTheme="minorHAnsi" w:cstheme="minorHAnsi"/>
@@ -2179,7 +1532,6 @@
               </w:rPr>
               <w:t>extNotes</w:t>
             </w:r>
-            <w:proofErr w:type="spellEnd"/>
             <w:r>
               <w:rPr>
                 <w:rFonts w:asciiTheme="minorHAnsi" w:hAnsiTheme="minorHAnsi" w:cstheme="minorHAnsi"/>
@@ -2200,8 +1552,6 @@
               </w:rPr>
               <w:t>/</w:t>
             </w:r>
-            <w:proofErr w:type="spellStart"/>
-            <w:proofErr w:type="gramStart"/>
             <w:r>
               <w:rPr>
                 <w:rFonts w:asciiTheme="minorHAnsi" w:hAnsiTheme="minorHAnsi" w:cstheme="minorHAnsi"/>
@@ -2213,7 +1563,6 @@
               </w:rPr>
               <w:t>extNotes</w:t>
             </w:r>
-            <w:proofErr w:type="spellEnd"/>
             <w:r>
               <w:rPr>
                 <w:rFonts w:asciiTheme="minorHAnsi" w:hAnsiTheme="minorHAnsi" w:cstheme="minorHAnsi"/>
@@ -2242,62 +1591,7 @@
                 <w:sz w:val="20"/>
                 <w:szCs w:val="20"/>
               </w:rPr>
-              <w:t>{</w:t>
-            </w:r>
-            <w:proofErr w:type="gramEnd"/>
-            <w:r>
-              <w:rPr>
-                <w:rFonts w:asciiTheme="minorHAnsi" w:hAnsiTheme="minorHAnsi" w:cstheme="minorHAnsi"/>
-                <w:b/>
-                <w:bCs/>
-                <w:sz w:val="20"/>
-                <w:szCs w:val="20"/>
-              </w:rPr>
-              <w:t>#fsc} - {</w:t>
-            </w:r>
-            <w:proofErr w:type="spellStart"/>
-            <w:r>
-              <w:rPr>
-                <w:rFonts w:asciiTheme="minorHAnsi" w:hAnsiTheme="minorHAnsi" w:cstheme="minorHAnsi"/>
-                <w:b/>
-                <w:bCs/>
-                <w:sz w:val="20"/>
-                <w:szCs w:val="20"/>
-              </w:rPr>
-              <w:t>fsc</w:t>
-            </w:r>
-            <w:proofErr w:type="spellEnd"/>
-            <w:r>
-              <w:rPr>
-                <w:rFonts w:asciiTheme="minorHAnsi" w:hAnsiTheme="minorHAnsi" w:cstheme="minorHAnsi"/>
-                <w:b/>
-                <w:bCs/>
-                <w:sz w:val="20"/>
-                <w:szCs w:val="20"/>
-              </w:rPr>
-              <w:t>}{/</w:t>
-            </w:r>
-            <w:proofErr w:type="spellStart"/>
-            <w:r>
-              <w:rPr>
-                <w:rFonts w:asciiTheme="minorHAnsi" w:hAnsiTheme="minorHAnsi" w:cstheme="minorHAnsi"/>
-                <w:b/>
-                <w:bCs/>
-                <w:sz w:val="20"/>
-                <w:szCs w:val="20"/>
-              </w:rPr>
-              <w:t>fsc</w:t>
-            </w:r>
-            <w:proofErr w:type="spellEnd"/>
-            <w:r>
-              <w:rPr>
-                <w:rFonts w:asciiTheme="minorHAnsi" w:hAnsiTheme="minorHAnsi" w:cstheme="minorHAnsi"/>
-                <w:b/>
-                <w:bCs/>
-                <w:sz w:val="20"/>
-                <w:szCs w:val="20"/>
-              </w:rPr>
-              <w:t>}</w:t>
+              <w:t>{#fsc} - {fsc}{/fsc}</w:t>
             </w:r>
           </w:p>
         </w:tc>
@@ -2325,61 +1619,7 @@
                 <w:sz w:val="18"/>
                 <w:szCs w:val="18"/>
               </w:rPr>
-              <w:t>{#</w:t>
-            </w:r>
-            <w:proofErr w:type="gramStart"/>
-            <w:r>
-              <w:rPr>
-                <w:rFonts w:asciiTheme="minorHAnsi" w:hAnsiTheme="minorHAnsi" w:cstheme="minorHAnsi"/>
-                <w:sz w:val="18"/>
-                <w:szCs w:val="18"/>
-              </w:rPr>
-              <w:t>invoices}{</w:t>
-            </w:r>
-            <w:proofErr w:type="gramEnd"/>
-            <w:r>
-              <w:rPr>
-                <w:rFonts w:asciiTheme="minorHAnsi" w:hAnsiTheme="minorHAnsi" w:cstheme="minorHAnsi"/>
-                <w:sz w:val="18"/>
-                <w:szCs w:val="18"/>
-              </w:rPr>
-              <w:t>prefixCode}\{containerFrom}{#containerTo} - {</w:t>
-            </w:r>
-            <w:proofErr w:type="spellStart"/>
-            <w:r>
-              <w:rPr>
-                <w:rFonts w:asciiTheme="minorHAnsi" w:hAnsiTheme="minorHAnsi" w:cstheme="minorHAnsi"/>
-                <w:sz w:val="18"/>
-                <w:szCs w:val="18"/>
-              </w:rPr>
-              <w:t>containerTo</w:t>
-            </w:r>
-            <w:proofErr w:type="spellEnd"/>
-            <w:r>
-              <w:rPr>
-                <w:rFonts w:asciiTheme="minorHAnsi" w:hAnsiTheme="minorHAnsi" w:cstheme="minorHAnsi"/>
-                <w:sz w:val="18"/>
-                <w:szCs w:val="18"/>
-              </w:rPr>
-              <w:t>}{/</w:t>
-            </w:r>
-            <w:proofErr w:type="spellStart"/>
-            <w:r>
-              <w:rPr>
-                <w:rFonts w:asciiTheme="minorHAnsi" w:hAnsiTheme="minorHAnsi" w:cstheme="minorHAnsi"/>
-                <w:sz w:val="18"/>
-                <w:szCs w:val="18"/>
-              </w:rPr>
-              <w:t>containerTo</w:t>
-            </w:r>
-            <w:proofErr w:type="spellEnd"/>
-            <w:r>
-              <w:rPr>
-                <w:rFonts w:asciiTheme="minorHAnsi" w:hAnsiTheme="minorHAnsi" w:cstheme="minorHAnsi"/>
-                <w:sz w:val="18"/>
-                <w:szCs w:val="18"/>
-              </w:rPr>
-              <w:t>}</w:t>
+              <w:t>{#invoices}{prefixCode}\{containerFrom}{#containerTo} - {containerTo}{/containerTo}</w:t>
             </w:r>
           </w:p>
         </w:tc>
@@ -2403,36 +1643,32 @@
                 <w:sz w:val="18"/>
                 <w:szCs w:val="18"/>
               </w:rPr>
-              <w:t>{</w:t>
-            </w:r>
-            <w:proofErr w:type="spellStart"/>
-            <w:r>
-              <w:rPr>
-                <w:rFonts w:asciiTheme="minorHAnsi" w:hAnsiTheme="minorHAnsi" w:cstheme="minorHAnsi"/>
-                <w:sz w:val="18"/>
-                <w:szCs w:val="18"/>
-              </w:rPr>
-              <w:t>materialGrade</w:t>
-            </w:r>
-            <w:proofErr w:type="spellEnd"/>
-            <w:r>
-              <w:rPr>
-                <w:rFonts w:asciiTheme="minorHAnsi" w:hAnsiTheme="minorHAnsi" w:cstheme="minorHAnsi"/>
-                <w:sz w:val="18"/>
-                <w:szCs w:val="18"/>
-              </w:rPr>
-              <w:t>}{</w:t>
-            </w:r>
-            <w:r>
-              <w:rPr>
-                <w:rFonts w:asciiTheme="minorHAnsi" w:hAnsiTheme="minorHAnsi" w:cstheme="minorHAnsi"/>
-                <w:sz w:val="18"/>
-                <w:szCs w:val="18"/>
-              </w:rPr>
-              <w:t>^</w:t>
-            </w:r>
-            <w:proofErr w:type="spellStart"/>
-            <w:proofErr w:type="gramStart"/>
+              <w:t>{materialGrade}{</w:t>
+            </w:r>
+            <w:r>
+              <w:rPr>
+                <w:rFonts w:asciiTheme="minorHAnsi" w:hAnsiTheme="minorHAnsi" w:cstheme="minorHAnsi"/>
+                <w:sz w:val="18"/>
+                <w:szCs w:val="18"/>
+              </w:rPr>
+              <w:t>^isAus</w:t>
+            </w:r>
+            <w:r>
+              <w:rPr>
+                <w:rFonts w:asciiTheme="minorHAnsi" w:hAnsiTheme="minorHAnsi" w:cstheme="minorHAnsi"/>
+                <w:sz w:val="18"/>
+                <w:szCs w:val="18"/>
+              </w:rPr>
+              <w:t xml:space="preserve">}  </w:t>
+            </w:r>
+            <w:r>
+              <w:rPr>
+                <w:rFonts w:asciiTheme="minorHAnsi" w:hAnsiTheme="minorHAnsi" w:cstheme="minorHAnsi"/>
+                <w:sz w:val="18"/>
+                <w:szCs w:val="18"/>
+              </w:rPr>
+              <w:t>{brandName}{/</w:t>
+            </w:r>
             <w:r>
               <w:rPr>
                 <w:rFonts w:asciiTheme="minorHAnsi" w:hAnsiTheme="minorHAnsi" w:cstheme="minorHAnsi"/>
@@ -2441,52 +1677,6 @@
               </w:rPr>
               <w:t>isAus</w:t>
             </w:r>
-            <w:proofErr w:type="spellEnd"/>
-            <w:r>
-              <w:rPr>
-                <w:rFonts w:asciiTheme="minorHAnsi" w:hAnsiTheme="minorHAnsi" w:cstheme="minorHAnsi"/>
-                <w:sz w:val="18"/>
-                <w:szCs w:val="18"/>
-              </w:rPr>
-              <w:t xml:space="preserve">}  </w:t>
-            </w:r>
-            <w:r>
-              <w:rPr>
-                <w:rFonts w:asciiTheme="minorHAnsi" w:hAnsiTheme="minorHAnsi" w:cstheme="minorHAnsi"/>
-                <w:sz w:val="18"/>
-                <w:szCs w:val="18"/>
-              </w:rPr>
-              <w:t>{</w:t>
-            </w:r>
-            <w:proofErr w:type="spellStart"/>
-            <w:proofErr w:type="gramEnd"/>
-            <w:r>
-              <w:rPr>
-                <w:rFonts w:asciiTheme="minorHAnsi" w:hAnsiTheme="minorHAnsi" w:cstheme="minorHAnsi"/>
-                <w:sz w:val="18"/>
-                <w:szCs w:val="18"/>
-              </w:rPr>
-              <w:t>brandName</w:t>
-            </w:r>
-            <w:proofErr w:type="spellEnd"/>
-            <w:r>
-              <w:rPr>
-                <w:rFonts w:asciiTheme="minorHAnsi" w:hAnsiTheme="minorHAnsi" w:cstheme="minorHAnsi"/>
-                <w:sz w:val="18"/>
-                <w:szCs w:val="18"/>
-              </w:rPr>
-              <w:t>}{/</w:t>
-            </w:r>
-            <w:proofErr w:type="spellStart"/>
-            <w:r>
-              <w:rPr>
-                <w:rFonts w:asciiTheme="minorHAnsi" w:hAnsiTheme="minorHAnsi" w:cstheme="minorHAnsi"/>
-                <w:sz w:val="18"/>
-                <w:szCs w:val="18"/>
-              </w:rPr>
-              <w:t>isAus</w:t>
-            </w:r>
-            <w:proofErr w:type="spellEnd"/>
             <w:r>
               <w:rPr>
                 <w:rFonts w:asciiTheme="minorHAnsi" w:hAnsiTheme="minorHAnsi" w:cstheme="minorHAnsi"/>
@@ -2527,7 +1717,6 @@
               </w:rPr>
               <w:t>#</w:t>
             </w:r>
-            <w:proofErr w:type="gramStart"/>
             <w:r>
               <w:rPr>
                 <w:rFonts w:asciiTheme="minorHAnsi" w:hAnsiTheme="minorHAnsi" w:cstheme="minorHAnsi"/>
@@ -2542,16 +1731,7 @@
                 <w:sz w:val="18"/>
                 <w:szCs w:val="18"/>
               </w:rPr>
-              <w:t>}{</w:t>
-            </w:r>
-            <w:proofErr w:type="gramEnd"/>
-            <w:r>
-              <w:rPr>
-                <w:rFonts w:asciiTheme="minorHAnsi" w:hAnsiTheme="minorHAnsi" w:cstheme="minorHAnsi"/>
-                <w:sz w:val="18"/>
-                <w:szCs w:val="18"/>
-              </w:rPr>
-              <w:t>brandName}</w:t>
+              <w:t>}{brandName}</w:t>
             </w:r>
             <w:r>
               <w:rPr>
@@ -2609,25 +1789,7 @@
                 <w:sz w:val="18"/>
                 <w:szCs w:val="18"/>
               </w:rPr>
-              <w:t>{</w:t>
-            </w:r>
-            <w:proofErr w:type="spellStart"/>
-            <w:r>
-              <w:rPr>
-                <w:rFonts w:cstheme="minorHAnsi"/>
-                <w:sz w:val="18"/>
-                <w:szCs w:val="18"/>
-              </w:rPr>
-              <w:t>designType</w:t>
-            </w:r>
-            <w:proofErr w:type="spellEnd"/>
-            <w:r>
-              <w:rPr>
-                <w:rFonts w:cstheme="minorHAnsi"/>
-                <w:sz w:val="18"/>
-                <w:szCs w:val="18"/>
-              </w:rPr>
-              <w:t>}</w:t>
+              <w:t>{designType}</w:t>
             </w:r>
           </w:p>
         </w:tc>
@@ -2651,25 +1813,7 @@
                 <w:sz w:val="18"/>
                 <w:szCs w:val="18"/>
               </w:rPr>
-              <w:t>{</w:t>
-            </w:r>
-            <w:proofErr w:type="spellStart"/>
-            <w:r>
-              <w:rPr>
-                <w:rFonts w:asciiTheme="minorHAnsi" w:hAnsiTheme="minorHAnsi" w:cstheme="minorHAnsi"/>
-                <w:sz w:val="18"/>
-                <w:szCs w:val="18"/>
-              </w:rPr>
-              <w:t>finishType</w:t>
-            </w:r>
-            <w:proofErr w:type="spellEnd"/>
-            <w:r>
-              <w:rPr>
-                <w:rFonts w:asciiTheme="minorHAnsi" w:hAnsiTheme="minorHAnsi" w:cstheme="minorHAnsi"/>
-                <w:sz w:val="18"/>
-                <w:szCs w:val="18"/>
-              </w:rPr>
-              <w:t>}</w:t>
+              <w:t>{finishType}</w:t>
             </w:r>
           </w:p>
         </w:tc>
@@ -2743,36 +1887,16 @@
                 <w:sz w:val="18"/>
                 <w:szCs w:val="18"/>
               </w:rPr>
-              <w:t>{value}{/</w:t>
-            </w:r>
-            <w:proofErr w:type="gramStart"/>
+              <w:t>{value}{/invoices}{/</w:t>
+            </w:r>
             <w:r>
               <w:rPr>
                 <w:rFonts w:cstheme="minorHAnsi"/>
                 <w:sz w:val="18"/>
                 <w:szCs w:val="18"/>
               </w:rPr>
-              <w:t>invoices}{</w:t>
-            </w:r>
-            <w:proofErr w:type="gramEnd"/>
-            <w:r>
-              <w:rPr>
-                <w:rFonts w:cstheme="minorHAnsi"/>
-                <w:sz w:val="18"/>
-                <w:szCs w:val="18"/>
-              </w:rPr>
-              <w:t>/</w:t>
-            </w:r>
-            <w:proofErr w:type="spellStart"/>
-            <w:r>
-              <w:rPr>
-                <w:rFonts w:cstheme="minorHAnsi"/>
-                <w:sz w:val="18"/>
-                <w:szCs w:val="18"/>
-              </w:rPr>
               <w:t>OCItems</w:t>
             </w:r>
-            <w:proofErr w:type="spellEnd"/>
             <w:r>
               <w:rPr>
                 <w:rFonts w:cstheme="minorHAnsi"/>
@@ -3028,29 +2152,7 @@
                 <w:sz w:val="18"/>
                 <w:szCs w:val="18"/>
               </w:rPr>
-              <w:t>{</w:t>
-            </w:r>
-            <w:proofErr w:type="spellStart"/>
-            <w:r>
-              <w:rPr>
-                <w:rFonts w:asciiTheme="minorHAnsi" w:hAnsiTheme="minorHAnsi" w:cstheme="minorHAnsi"/>
-                <w:b/>
-                <w:bCs/>
-                <w:sz w:val="18"/>
-                <w:szCs w:val="18"/>
-              </w:rPr>
-              <w:t>totalQuantity</w:t>
-            </w:r>
-            <w:proofErr w:type="spellEnd"/>
-            <w:r>
-              <w:rPr>
-                <w:rFonts w:asciiTheme="minorHAnsi" w:hAnsiTheme="minorHAnsi" w:cstheme="minorHAnsi"/>
-                <w:b/>
-                <w:bCs/>
-                <w:sz w:val="18"/>
-                <w:szCs w:val="18"/>
-              </w:rPr>
-              <w:t>}</w:t>
+              <w:t>{totalQuantity}</w:t>
             </w:r>
           </w:p>
         </w:tc>
@@ -3094,29 +2196,7 @@
                 <w:sz w:val="18"/>
                 <w:szCs w:val="18"/>
               </w:rPr>
-              <w:t>{</w:t>
-            </w:r>
-            <w:proofErr w:type="spellStart"/>
-            <w:r>
-              <w:rPr>
-                <w:rFonts w:cstheme="minorHAnsi"/>
-                <w:b/>
-                <w:bCs/>
-                <w:sz w:val="18"/>
-                <w:szCs w:val="18"/>
-              </w:rPr>
-              <w:t>totalAmount</w:t>
-            </w:r>
-            <w:proofErr w:type="spellEnd"/>
-            <w:r>
-              <w:rPr>
-                <w:rFonts w:cstheme="minorHAnsi"/>
-                <w:b/>
-                <w:bCs/>
-                <w:sz w:val="18"/>
-                <w:szCs w:val="18"/>
-              </w:rPr>
-              <w:t>}</w:t>
+              <w:t>{totalAmount}</w:t>
             </w:r>
           </w:p>
         </w:tc>
@@ -3457,25 +2537,7 @@
                 <w:sz w:val="18"/>
                 <w:szCs w:val="18"/>
               </w:rPr>
-              <w:t>{</w:t>
-            </w:r>
-            <w:proofErr w:type="spellStart"/>
-            <w:r>
-              <w:rPr>
-                <w:rFonts w:cstheme="minorHAnsi"/>
-                <w:sz w:val="18"/>
-                <w:szCs w:val="18"/>
-              </w:rPr>
-              <w:t>totalAddition</w:t>
-            </w:r>
-            <w:proofErr w:type="spellEnd"/>
-            <w:r>
-              <w:rPr>
-                <w:rFonts w:cstheme="minorHAnsi"/>
-                <w:sz w:val="18"/>
-                <w:szCs w:val="18"/>
-              </w:rPr>
-              <w:t>}</w:t>
+              <w:t>{totalAddition}</w:t>
             </w:r>
           </w:p>
         </w:tc>
@@ -3614,25 +2676,7 @@
                 <w:sz w:val="18"/>
                 <w:szCs w:val="18"/>
               </w:rPr>
-              <w:t>{</w:t>
-            </w:r>
-            <w:proofErr w:type="spellStart"/>
-            <w:r>
-              <w:rPr>
-                <w:rFonts w:cstheme="minorHAnsi"/>
-                <w:sz w:val="18"/>
-                <w:szCs w:val="18"/>
-              </w:rPr>
-              <w:t>totalDiscount</w:t>
-            </w:r>
-            <w:proofErr w:type="spellEnd"/>
-            <w:r>
-              <w:rPr>
-                <w:rFonts w:cstheme="minorHAnsi"/>
-                <w:sz w:val="18"/>
-                <w:szCs w:val="18"/>
-              </w:rPr>
-              <w:t>}</w:t>
+              <w:t>{totalDiscount}</w:t>
             </w:r>
           </w:p>
         </w:tc>
@@ -3836,7 +2880,6 @@
               </w:rPr>
               <w:t>Total {</w:t>
             </w:r>
-            <w:proofErr w:type="spellStart"/>
             <w:r>
               <w:rPr>
                 <w:rFonts w:asciiTheme="minorHAnsi" w:hAnsiTheme="minorHAnsi" w:cstheme="minorHAnsi"/>
@@ -3848,7 +2891,6 @@
               </w:rPr>
               <w:t>deliveryTerms</w:t>
             </w:r>
-            <w:proofErr w:type="spellEnd"/>
             <w:r>
               <w:rPr>
                 <w:rFonts w:asciiTheme="minorHAnsi" w:hAnsiTheme="minorHAnsi" w:cstheme="minorHAnsi"/>
@@ -3869,8 +2911,6 @@
               </w:rPr>
               <w:t xml:space="preserve"> {</w:t>
             </w:r>
-            <w:proofErr w:type="spellStart"/>
-            <w:proofErr w:type="gramStart"/>
             <w:r>
               <w:rPr>
                 <w:rFonts w:asciiTheme="minorHAnsi" w:hAnsiTheme="minorHAnsi" w:cstheme="minorHAnsi"/>
@@ -3882,7 +2922,6 @@
               </w:rPr>
               <w:t>dischargeTerms</w:t>
             </w:r>
-            <w:proofErr w:type="spellEnd"/>
             <w:r>
               <w:rPr>
                 <w:rFonts w:asciiTheme="minorHAnsi" w:hAnsiTheme="minorHAnsi" w:cstheme="minorHAnsi"/>
@@ -3917,30 +2956,7 @@
                 <w:sz w:val="18"/>
                 <w:szCs w:val="18"/>
               </w:rPr>
-              <w:t>{</w:t>
-            </w:r>
-            <w:proofErr w:type="spellStart"/>
-            <w:proofErr w:type="gramEnd"/>
-            <w:r>
-              <w:rPr>
-                <w:rFonts w:asciiTheme="minorHAnsi" w:hAnsiTheme="minorHAnsi" w:cstheme="minorHAnsi"/>
-                <w:b/>
-                <w:bCs/>
-                <w:sz w:val="18"/>
-                <w:szCs w:val="18"/>
-              </w:rPr>
-              <w:t>currencyChar</w:t>
-            </w:r>
-            <w:proofErr w:type="spellEnd"/>
-            <w:r>
-              <w:rPr>
-                <w:rFonts w:asciiTheme="minorHAnsi" w:hAnsiTheme="minorHAnsi" w:cstheme="minorHAnsi"/>
-                <w:b/>
-                <w:bCs/>
-                <w:sz w:val="18"/>
-                <w:szCs w:val="18"/>
-              </w:rPr>
-              <w:t>}</w:t>
+              <w:t>{currencyChar}</w:t>
             </w:r>
             <w:r>
               <w:rPr>
@@ -3960,29 +2976,7 @@
                 <w:sz w:val="18"/>
                 <w:szCs w:val="18"/>
               </w:rPr>
-              <w:t>{</w:t>
-            </w:r>
-            <w:proofErr w:type="spellStart"/>
-            <w:r>
-              <w:rPr>
-                <w:rFonts w:asciiTheme="minorHAnsi" w:hAnsiTheme="minorHAnsi" w:cstheme="minorHAnsi"/>
-                <w:b/>
-                <w:bCs/>
-                <w:sz w:val="18"/>
-                <w:szCs w:val="18"/>
-              </w:rPr>
-              <w:t>netAmountWords</w:t>
-            </w:r>
-            <w:proofErr w:type="spellEnd"/>
-            <w:r>
-              <w:rPr>
-                <w:rFonts w:asciiTheme="minorHAnsi" w:hAnsiTheme="minorHAnsi" w:cstheme="minorHAnsi"/>
-                <w:b/>
-                <w:bCs/>
-                <w:sz w:val="18"/>
-                <w:szCs w:val="18"/>
-              </w:rPr>
-              <w:t>} Only</w:t>
+              <w:t>{netAmountWords} Only</w:t>
             </w:r>
           </w:p>
         </w:tc>
@@ -4023,18 +3017,8 @@
                 <w:sz w:val="18"/>
                 <w:szCs w:val="18"/>
               </w:rPr>
-              <w:t>{</w:t>
-            </w:r>
-            <w:proofErr w:type="spellStart"/>
-            <w:r>
-              <w:rPr>
-                <w:rFonts w:asciiTheme="minorHAnsi" w:hAnsiTheme="minorHAnsi" w:cstheme="minorHAnsi"/>
-                <w:sz w:val="18"/>
-                <w:szCs w:val="18"/>
-              </w:rPr>
-              <w:t>netAmount</w:t>
-            </w:r>
-            <w:proofErr w:type="spellEnd"/>
+              <w:t>{netAmount</w:t>
+            </w:r>
             <w:r>
               <w:rPr>
                 <w:rFonts w:asciiTheme="minorHAnsi" w:hAnsiTheme="minorHAnsi" w:cstheme="minorHAnsi"/>
@@ -4130,7 +3114,6 @@
               </w:rPr>
               <w:t>{</w:t>
             </w:r>
-            <w:proofErr w:type="spellStart"/>
             <w:r>
               <w:rPr>
                 <w:rFonts w:asciiTheme="minorHAnsi" w:hAnsiTheme="minorHAnsi" w:cstheme="minorHAnsi"/>
@@ -4140,7 +3123,6 @@
               </w:rPr>
               <w:t>deliveryDetails</w:t>
             </w:r>
-            <w:proofErr w:type="spellEnd"/>
             <w:r>
               <w:rPr>
                 <w:rFonts w:asciiTheme="minorHAnsi" w:hAnsiTheme="minorHAnsi" w:cstheme="minorHAnsi"/>
@@ -4234,25 +3216,7 @@
                 <w:sz w:val="18"/>
                 <w:szCs w:val="18"/>
               </w:rPr>
-              <w:t>{</w:t>
-            </w:r>
-            <w:proofErr w:type="spellStart"/>
-            <w:r>
-              <w:rPr>
-                <w:rFonts w:asciiTheme="minorHAnsi" w:hAnsiTheme="minorHAnsi" w:cstheme="minorHAnsi"/>
-                <w:sz w:val="18"/>
-                <w:szCs w:val="18"/>
-              </w:rPr>
-              <w:t>bNameOC</w:t>
-            </w:r>
-            <w:proofErr w:type="spellEnd"/>
-            <w:r>
-              <w:rPr>
-                <w:rFonts w:asciiTheme="minorHAnsi" w:hAnsiTheme="minorHAnsi" w:cstheme="minorHAnsi"/>
-                <w:sz w:val="18"/>
-                <w:szCs w:val="18"/>
-              </w:rPr>
-              <w:t xml:space="preserve">} </w:t>
+              <w:t xml:space="preserve">{bNameOC} </w:t>
             </w:r>
           </w:p>
           <w:p>
@@ -4272,7 +3236,6 @@
               </w:rPr>
               <w:t>{#</w:t>
             </w:r>
-            <w:proofErr w:type="gramStart"/>
             <w:r>
               <w:rPr>
                 <w:rFonts w:asciiTheme="minorHAnsi" w:hAnsiTheme="minorHAnsi" w:cstheme="minorHAnsi"/>
@@ -4295,16 +3258,7 @@
                 <w:sz w:val="18"/>
                 <w:szCs w:val="18"/>
               </w:rPr>
-              <w:t>{</w:t>
-            </w:r>
-            <w:proofErr w:type="gramEnd"/>
-            <w:r>
-              <w:rPr>
-                <w:rFonts w:asciiTheme="minorHAnsi" w:hAnsiTheme="minorHAnsi" w:cstheme="minorHAnsi"/>
-                <w:sz w:val="18"/>
-                <w:szCs w:val="18"/>
-              </w:rPr>
-              <w:t>bBranchOC}</w:t>
+              <w:t>{bBranchOC}</w:t>
             </w:r>
             <w:r>
               <w:rPr>
@@ -4330,7 +3284,6 @@
               </w:rPr>
               <w:t>{/</w:t>
             </w:r>
-            <w:proofErr w:type="spellStart"/>
             <w:r>
               <w:rPr>
                 <w:rFonts w:asciiTheme="minorHAnsi" w:hAnsiTheme="minorHAnsi" w:cstheme="minorHAnsi"/>
@@ -4339,7 +3292,6 @@
               </w:rPr>
               <w:t>bBranchOC</w:t>
             </w:r>
-            <w:proofErr w:type="spellEnd"/>
             <w:r>
               <w:rPr>
                 <w:rFonts w:asciiTheme="minorHAnsi" w:hAnsiTheme="minorHAnsi" w:cstheme="minorHAnsi"/>
@@ -4364,36 +3316,34 @@
                 <w:sz w:val="18"/>
                 <w:szCs w:val="18"/>
               </w:rPr>
-              <w:t>{</w:t>
-            </w:r>
-            <w:proofErr w:type="spellStart"/>
-            <w:r>
-              <w:rPr>
-                <w:rFonts w:asciiTheme="minorHAnsi" w:hAnsiTheme="minorHAnsi" w:cstheme="minorHAnsi"/>
-                <w:sz w:val="18"/>
-                <w:szCs w:val="18"/>
-              </w:rPr>
-              <w:t>bAddressOC</w:t>
-            </w:r>
-            <w:proofErr w:type="spellEnd"/>
-            <w:r>
-              <w:rPr>
-                <w:rFonts w:asciiTheme="minorHAnsi" w:hAnsiTheme="minorHAnsi" w:cstheme="minorHAnsi"/>
-                <w:sz w:val="18"/>
-                <w:szCs w:val="18"/>
-              </w:rPr>
-              <w:t>}{</w:t>
-            </w:r>
-            <w:proofErr w:type="spellStart"/>
-            <w:r>
-              <w:rPr>
-                <w:rFonts w:asciiTheme="minorHAnsi" w:hAnsiTheme="minorHAnsi" w:cstheme="minorHAnsi"/>
-                <w:sz w:val="18"/>
-                <w:szCs w:val="18"/>
-              </w:rPr>
-              <w:t>bCityOC</w:t>
-            </w:r>
-            <w:proofErr w:type="spellEnd"/>
+              <w:t>{bAddressOC}{bCityOC}</w:t>
+            </w:r>
+          </w:p>
+          <w:p>
+            <w:pPr>
+              <w:ind w:right="227"/>
+              <w:rPr>
+                <w:rFonts w:asciiTheme="minorHAnsi" w:hAnsiTheme="minorHAnsi" w:cstheme="minorHAnsi"/>
+                <w:sz w:val="18"/>
+                <w:szCs w:val="18"/>
+              </w:rPr>
+            </w:pPr>
+            <w:r>
+              <w:rPr>
+                <w:rFonts w:asciiTheme="minorHAnsi" w:hAnsiTheme="minorHAnsi" w:cstheme="minorHAnsi"/>
+                <w:sz w:val="18"/>
+                <w:szCs w:val="18"/>
+              </w:rPr>
+              <w:t>{#</w:t>
+            </w:r>
+            <w:r>
+              <w:rPr>
+                <w:rFonts w:asciiTheme="minorHAnsi" w:hAnsiTheme="minorHAnsi" w:cstheme="minorHAnsi"/>
+                <w:sz w:val="18"/>
+                <w:szCs w:val="18"/>
+              </w:rPr>
+              <w:t>swiftNumberOC</w:t>
+            </w:r>
             <w:r>
               <w:rPr>
                 <w:rFonts w:asciiTheme="minorHAnsi" w:hAnsiTheme="minorHAnsi" w:cstheme="minorHAnsi"/>
@@ -4402,23 +3352,21 @@
               </w:rPr>
               <w:t>}</w:t>
             </w:r>
-          </w:p>
-          <w:p>
-            <w:pPr>
-              <w:ind w:right="227"/>
-              <w:rPr>
-                <w:rFonts w:asciiTheme="minorHAnsi" w:hAnsiTheme="minorHAnsi" w:cstheme="minorHAnsi"/>
-                <w:sz w:val="18"/>
-                <w:szCs w:val="18"/>
-              </w:rPr>
-            </w:pPr>
-            <w:r>
-              <w:rPr>
-                <w:rFonts w:asciiTheme="minorHAnsi" w:hAnsiTheme="minorHAnsi" w:cstheme="minorHAnsi"/>
-                <w:sz w:val="18"/>
-                <w:szCs w:val="18"/>
-              </w:rPr>
-              <w:t>{#</w:t>
+            <w:r>
+              <w:rPr>
+                <w:rFonts w:asciiTheme="minorHAnsi" w:hAnsiTheme="minorHAnsi" w:cstheme="minorHAnsi"/>
+                <w:sz w:val="18"/>
+                <w:szCs w:val="18"/>
+              </w:rPr>
+              <w:t>SWIFT – {swiftNumberOC}</w:t>
+            </w:r>
+            <w:r>
+              <w:rPr>
+                <w:rFonts w:asciiTheme="minorHAnsi" w:hAnsiTheme="minorHAnsi" w:cstheme="minorHAnsi"/>
+                <w:sz w:val="18"/>
+                <w:szCs w:val="18"/>
+              </w:rPr>
+              <w:t>{/</w:t>
             </w:r>
             <w:r>
               <w:rPr>
@@ -4428,58 +3376,6 @@
               </w:rPr>
               <w:t>swiftNumberOC</w:t>
             </w:r>
-            <w:r>
-              <w:rPr>
-                <w:rFonts w:asciiTheme="minorHAnsi" w:hAnsiTheme="minorHAnsi" w:cstheme="minorHAnsi"/>
-                <w:sz w:val="18"/>
-                <w:szCs w:val="18"/>
-              </w:rPr>
-              <w:t>}</w:t>
-            </w:r>
-            <w:r>
-              <w:rPr>
-                <w:rFonts w:asciiTheme="minorHAnsi" w:hAnsiTheme="minorHAnsi" w:cstheme="minorHAnsi"/>
-                <w:sz w:val="18"/>
-                <w:szCs w:val="18"/>
-              </w:rPr>
-              <w:t>SWIFT – {</w:t>
-            </w:r>
-            <w:proofErr w:type="spellStart"/>
-            <w:r>
-              <w:rPr>
-                <w:rFonts w:asciiTheme="minorHAnsi" w:hAnsiTheme="minorHAnsi" w:cstheme="minorHAnsi"/>
-                <w:sz w:val="18"/>
-                <w:szCs w:val="18"/>
-              </w:rPr>
-              <w:t>swiftNumberOC</w:t>
-            </w:r>
-            <w:proofErr w:type="spellEnd"/>
-            <w:r>
-              <w:rPr>
-                <w:rFonts w:asciiTheme="minorHAnsi" w:hAnsiTheme="minorHAnsi" w:cstheme="minorHAnsi"/>
-                <w:sz w:val="18"/>
-                <w:szCs w:val="18"/>
-              </w:rPr>
-              <w:t>}</w:t>
-            </w:r>
-            <w:r>
-              <w:rPr>
-                <w:rFonts w:asciiTheme="minorHAnsi" w:hAnsiTheme="minorHAnsi" w:cstheme="minorHAnsi"/>
-                <w:sz w:val="18"/>
-                <w:szCs w:val="18"/>
-              </w:rPr>
-              <w:t>{/</w:t>
-            </w:r>
-            <w:proofErr w:type="spellStart"/>
-            <w:r>
-              <w:rPr>
-                <w:rFonts w:asciiTheme="minorHAnsi" w:hAnsiTheme="minorHAnsi" w:cstheme="minorHAnsi"/>
-                <w:sz w:val="18"/>
-                <w:szCs w:val="18"/>
-              </w:rPr>
-              <w:t>swiftNumberOC</w:t>
-            </w:r>
-            <w:proofErr w:type="spellEnd"/>
             <w:r>
               <w:rPr>
                 <w:rFonts w:asciiTheme="minorHAnsi" w:hAnsiTheme="minorHAnsi" w:cstheme="minorHAnsi"/>
@@ -4542,19 +3438,8 @@
                 <w:szCs w:val="18"/>
                 <w:lang w:val="en-IN"/>
               </w:rPr>
-              <w:t>{</w:t>
-            </w:r>
-            <w:proofErr w:type="spellStart"/>
-            <w:r>
-              <w:rPr>
-                <w:rFonts w:asciiTheme="minorHAnsi" w:hAnsiTheme="minorHAnsi" w:cstheme="minorHAnsi"/>
-                <w:sz w:val="18"/>
-                <w:szCs w:val="18"/>
-                <w:lang w:val="en-IN"/>
-              </w:rPr>
-              <w:t>shippingDetails</w:t>
-            </w:r>
-            <w:proofErr w:type="spellEnd"/>
+              <w:t>{shippingDetails</w:t>
+            </w:r>
             <w:r>
               <w:rPr>
                 <w:rFonts w:asciiTheme="minorHAnsi" w:hAnsiTheme="minorHAnsi" w:cstheme="minorHAnsi"/>
@@ -4671,7 +3556,6 @@
               </w:rPr>
               <w:t>{</w:t>
             </w:r>
-            <w:proofErr w:type="spellStart"/>
             <w:r>
               <w:rPr>
                 <w:rFonts w:asciiTheme="minorHAnsi" w:hAnsiTheme="minorHAnsi" w:cstheme="minorHAnsi"/>
@@ -4679,17 +3563,7 @@
                 <w:szCs w:val="18"/>
                 <w:lang w:val="en-IN"/>
               </w:rPr>
-              <w:t>paymentTerms</w:t>
-            </w:r>
-            <w:proofErr w:type="spellEnd"/>
-            <w:r>
-              <w:rPr>
-                <w:rFonts w:asciiTheme="minorHAnsi" w:hAnsiTheme="minorHAnsi" w:cstheme="minorHAnsi"/>
-                <w:sz w:val="18"/>
-                <w:szCs w:val="18"/>
-                <w:lang w:val="en-IN"/>
-              </w:rPr>
-              <w:t>}</w:t>
+              <w:t>paymentTerms}</w:t>
             </w:r>
           </w:p>
         </w:tc>
@@ -4925,25 +3799,7 @@
                 <w:sz w:val="18"/>
                 <w:szCs w:val="18"/>
               </w:rPr>
-              <w:t>{.}{/</w:t>
-            </w:r>
-            <w:proofErr w:type="spellStart"/>
-            <w:r>
-              <w:rPr>
-                <w:rFonts w:asciiTheme="minorHAnsi" w:hAnsiTheme="minorHAnsi" w:cstheme="minorHAnsi"/>
-                <w:sz w:val="18"/>
-                <w:szCs w:val="18"/>
-              </w:rPr>
-              <w:t>invoiceInstructions</w:t>
-            </w:r>
-            <w:proofErr w:type="spellEnd"/>
-            <w:r>
-              <w:rPr>
-                <w:rFonts w:asciiTheme="minorHAnsi" w:hAnsiTheme="minorHAnsi" w:cstheme="minorHAnsi"/>
-                <w:sz w:val="18"/>
-                <w:szCs w:val="18"/>
-              </w:rPr>
-              <w:t>}</w:t>
+              <w:t>{.}{/invoiceInstructions}</w:t>
             </w:r>
           </w:p>
         </w:tc>
@@ -5013,7 +3869,6 @@
     <w:r>
       <w:t xml:space="preserve">      </w:t>
     </w:r>
-    <w:proofErr w:type="gramStart"/>
     <w:r>
       <w:rPr>
         <w:spacing w:val="60"/>
@@ -5030,9 +3885,8 @@
       <w:rPr>
         <w:spacing w:val="60"/>
       </w:rPr>
-      <w:t xml:space="preserve"> ICA</w:t>
+      <w:t xml:space="preserve"> ICA </w:t>
     </w:r>
-    <w:proofErr w:type="gramEnd"/>
     <w:r>
       <w:rPr>
         <w:spacing w:val="60"/>
@@ -5043,34 +3897,20 @@
       <w:rPr>
         <w:spacing w:val="60"/>
       </w:rPr>
+      <w:t>(I)</w:t>
+    </w:r>
+    <w:r>
+      <w:rPr>
+        <w:spacing w:val="60"/>
+      </w:rPr>
       <w:t xml:space="preserve"> </w:t>
     </w:r>
     <w:r>
       <w:rPr>
         <w:spacing w:val="60"/>
       </w:rPr>
-      <w:t>(I</w:t>
-    </w:r>
-    <w:proofErr w:type="gramStart"/>
-    <w:r>
-      <w:rPr>
-        <w:spacing w:val="60"/>
-      </w:rPr>
-      <w:t>)</w:t>
-    </w:r>
-    <w:r>
-      <w:rPr>
-        <w:spacing w:val="60"/>
-      </w:rPr>
-      <w:t xml:space="preserve"> </w:t>
-    </w:r>
-    <w:r>
-      <w:rPr>
-        <w:spacing w:val="60"/>
-      </w:rPr>
       <w:t xml:space="preserve"> LTD</w:t>
     </w:r>
-    <w:proofErr w:type="gramEnd"/>
   </w:p>
   <w:p>
     <w:pPr>
@@ -5372,15 +4212,6 @@
         <w:color w:val="auto"/>
       </w:rPr>
       <w:tab/>
-    </w:r>
-    <w:proofErr w:type="gramStart"/>
-    <w:r>
-      <w:rPr>
-        <w:rFonts w:ascii="Arial" w:hAnsi="Arial" w:cs="Arial"/>
-        <w:b/>
-        <w:bCs/>
-        <w:color w:val="auto"/>
-      </w:rPr>
       <w:t>D</w:t>
     </w:r>
     <w:r>
@@ -5403,7 +4234,6 @@
       </w:rPr>
       <w:t>.</w:t>
     </w:r>
-    <w:proofErr w:type="gramEnd"/>
   </w:p>
   <w:p>
     <w:pPr>
@@ -7045,6 +5875,7 @@
   <w:style w:type="character" w:default="1" w:styleId="DefaultParagraphFont">
     <w:name w:val="Default Paragraph Font"/>
     <w:uiPriority w:val="1"/>
+    <w:semiHidden/>
     <w:unhideWhenUsed/>
   </w:style>
   <w:style w:type="table" w:default="1" w:styleId="TableNormal">

</xml_diff>

<commit_message>
Seprate pi for aus
</commit_message>
<xml_diff>
--- a/electron/database/generate-document/templates/order-confirmation.docx
+++ b/electron/database/generate-document/templates/order-confirmation.docx
@@ -1548,8 +1548,8 @@
         </w:tc>
         <w:tc>
           <w:tcPr>
-            <w:tcW w:w="1985" w:type="dxa"/>
-            <w:gridSpan w:val="2"/>
+            <w:tcW w:w="3827" w:type="dxa"/>
+            <w:gridSpan w:val="4"/>
           </w:tcPr>
           <w:p>
             <w:pPr>
@@ -1564,227 +1564,11 @@
               <w:rPr>
                 <w:rFonts w:asciiTheme="minorHAnsi" w:hAnsiTheme="minorHAnsi" w:cstheme="minorHAnsi"/>
                 <w:b/>
-                <w:bCs/>
+                <w:spacing w:val="-4"/>
                 <w:sz w:val="20"/>
                 <w:szCs w:val="24"/>
               </w:rPr>
-              <w:t>{#</w:t>
-            </w:r>
-            <w:proofErr w:type="gramStart"/>
-            <w:r>
-              <w:rPr>
-                <w:rFonts w:asciiTheme="minorHAnsi" w:hAnsiTheme="minorHAnsi" w:cstheme="minorHAnsi"/>
-                <w:b/>
-                <w:bCs/>
-                <w:sz w:val="20"/>
-                <w:szCs w:val="24"/>
-              </w:rPr>
-              <w:t>isAus}ASW</w:t>
-            </w:r>
-            <w:proofErr w:type="gramEnd"/>
-            <w:r>
-              <w:rPr>
-                <w:rFonts w:asciiTheme="minorHAnsi" w:hAnsiTheme="minorHAnsi" w:cstheme="minorHAnsi"/>
-                <w:b/>
-                <w:bCs/>
-                <w:sz w:val="20"/>
-                <w:szCs w:val="24"/>
-              </w:rPr>
-              <w:t xml:space="preserve"> No{/</w:t>
-            </w:r>
-            <w:proofErr w:type="spellStart"/>
-            <w:proofErr w:type="gramStart"/>
-            <w:r>
-              <w:rPr>
-                <w:rFonts w:asciiTheme="minorHAnsi" w:hAnsiTheme="minorHAnsi" w:cstheme="minorHAnsi"/>
-                <w:b/>
-                <w:bCs/>
-                <w:sz w:val="20"/>
-                <w:szCs w:val="24"/>
-              </w:rPr>
-              <w:t>isAus</w:t>
-            </w:r>
-            <w:proofErr w:type="spellEnd"/>
-            <w:r>
-              <w:rPr>
-                <w:rFonts w:asciiTheme="minorHAnsi" w:hAnsiTheme="minorHAnsi" w:cstheme="minorHAnsi"/>
-                <w:b/>
-                <w:bCs/>
-                <w:sz w:val="20"/>
-                <w:szCs w:val="24"/>
-              </w:rPr>
-              <w:t>}{</w:t>
-            </w:r>
-            <w:proofErr w:type="gramEnd"/>
-            <w:r>
-              <w:rPr>
-                <w:rFonts w:asciiTheme="minorHAnsi" w:hAnsiTheme="minorHAnsi" w:cstheme="minorHAnsi"/>
-                <w:b/>
-                <w:bCs/>
-                <w:sz w:val="20"/>
-                <w:szCs w:val="24"/>
-              </w:rPr>
-              <w:t>^</w:t>
-            </w:r>
-            <w:proofErr w:type="spellStart"/>
-            <w:proofErr w:type="gramStart"/>
-            <w:r>
-              <w:rPr>
-                <w:rFonts w:asciiTheme="minorHAnsi" w:hAnsiTheme="minorHAnsi" w:cstheme="minorHAnsi"/>
-                <w:b/>
-                <w:bCs/>
-                <w:sz w:val="20"/>
-                <w:szCs w:val="24"/>
-              </w:rPr>
-              <w:t>isAus</w:t>
-            </w:r>
-            <w:proofErr w:type="spellEnd"/>
-            <w:r>
-              <w:rPr>
-                <w:rFonts w:asciiTheme="minorHAnsi" w:hAnsiTheme="minorHAnsi" w:cstheme="minorHAnsi"/>
-                <w:b/>
-                <w:bCs/>
-                <w:sz w:val="20"/>
-                <w:szCs w:val="24"/>
-              </w:rPr>
-              <w:t>}</w:t>
-            </w:r>
-            <w:r>
-              <w:rPr>
-                <w:rFonts w:asciiTheme="minorHAnsi" w:hAnsiTheme="minorHAnsi" w:cstheme="minorHAnsi"/>
-                <w:b/>
-                <w:spacing w:val="-4"/>
-                <w:sz w:val="20"/>
-                <w:szCs w:val="24"/>
-              </w:rPr>
               <w:t>Code</w:t>
-            </w:r>
-            <w:proofErr w:type="gramEnd"/>
-            <w:r>
-              <w:rPr>
-                <w:rFonts w:asciiTheme="minorHAnsi" w:hAnsiTheme="minorHAnsi" w:cstheme="minorHAnsi"/>
-                <w:b/>
-                <w:bCs/>
-                <w:sz w:val="20"/>
-                <w:szCs w:val="24"/>
-              </w:rPr>
-              <w:t>{/</w:t>
-            </w:r>
-            <w:proofErr w:type="spellStart"/>
-            <w:r>
-              <w:rPr>
-                <w:rFonts w:asciiTheme="minorHAnsi" w:hAnsiTheme="minorHAnsi" w:cstheme="minorHAnsi"/>
-                <w:b/>
-                <w:bCs/>
-                <w:sz w:val="20"/>
-                <w:szCs w:val="24"/>
-              </w:rPr>
-              <w:t>isAus</w:t>
-            </w:r>
-            <w:proofErr w:type="spellEnd"/>
-            <w:r>
-              <w:rPr>
-                <w:rFonts w:asciiTheme="minorHAnsi" w:hAnsiTheme="minorHAnsi" w:cstheme="minorHAnsi"/>
-                <w:b/>
-                <w:bCs/>
-                <w:sz w:val="20"/>
-                <w:szCs w:val="24"/>
-              </w:rPr>
-              <w:t>}</w:t>
-            </w:r>
-          </w:p>
-        </w:tc>
-        <w:tc>
-          <w:tcPr>
-            <w:tcW w:w="1842" w:type="dxa"/>
-            <w:gridSpan w:val="2"/>
-          </w:tcPr>
-          <w:p>
-            <w:pPr>
-              <w:ind w:right="113"/>
-              <w:rPr>
-                <w:rFonts w:asciiTheme="minorHAnsi" w:hAnsiTheme="minorHAnsi" w:cstheme="minorHAnsi"/>
-                <w:sz w:val="20"/>
-                <w:szCs w:val="24"/>
-              </w:rPr>
-            </w:pPr>
-            <w:r>
-              <w:rPr>
-                <w:rFonts w:asciiTheme="minorHAnsi" w:hAnsiTheme="minorHAnsi" w:cstheme="minorHAnsi"/>
-                <w:b/>
-                <w:bCs/>
-                <w:sz w:val="20"/>
-                <w:szCs w:val="24"/>
-              </w:rPr>
-              <w:t>{#</w:t>
-            </w:r>
-            <w:proofErr w:type="gramStart"/>
-            <w:r>
-              <w:rPr>
-                <w:rFonts w:asciiTheme="minorHAnsi" w:hAnsiTheme="minorHAnsi" w:cstheme="minorHAnsi"/>
-                <w:b/>
-                <w:bCs/>
-                <w:sz w:val="20"/>
-                <w:szCs w:val="24"/>
-              </w:rPr>
-              <w:t>isAus}ASW</w:t>
-            </w:r>
-            <w:proofErr w:type="gramEnd"/>
-            <w:r>
-              <w:rPr>
-                <w:rFonts w:asciiTheme="minorHAnsi" w:hAnsiTheme="minorHAnsi" w:cstheme="minorHAnsi"/>
-                <w:b/>
-                <w:bCs/>
-                <w:sz w:val="20"/>
-                <w:szCs w:val="24"/>
-              </w:rPr>
-              <w:t xml:space="preserve"> </w:t>
-            </w:r>
-            <w:proofErr w:type="spellStart"/>
-            <w:proofErr w:type="gramStart"/>
-            <w:r>
-              <w:rPr>
-                <w:rFonts w:asciiTheme="minorHAnsi" w:hAnsiTheme="minorHAnsi" w:cstheme="minorHAnsi"/>
-                <w:b/>
-                <w:bCs/>
-                <w:sz w:val="20"/>
-                <w:szCs w:val="24"/>
-              </w:rPr>
-              <w:t>PO.No</w:t>
-            </w:r>
-            <w:proofErr w:type="spellEnd"/>
-            <w:proofErr w:type="gramEnd"/>
-            <w:r>
-              <w:rPr>
-                <w:rFonts w:asciiTheme="minorHAnsi" w:hAnsiTheme="minorHAnsi" w:cstheme="minorHAnsi"/>
-                <w:b/>
-                <w:bCs/>
-                <w:sz w:val="20"/>
-                <w:szCs w:val="24"/>
-              </w:rPr>
-              <w:t>{/</w:t>
-            </w:r>
-            <w:proofErr w:type="spellStart"/>
-            <w:r>
-              <w:rPr>
-                <w:rFonts w:asciiTheme="minorHAnsi" w:hAnsiTheme="minorHAnsi" w:cstheme="minorHAnsi"/>
-                <w:b/>
-                <w:bCs/>
-                <w:sz w:val="20"/>
-                <w:szCs w:val="24"/>
-              </w:rPr>
-              <w:t>isAus</w:t>
-            </w:r>
-            <w:proofErr w:type="spellEnd"/>
-            <w:r>
-              <w:rPr>
-                <w:rFonts w:asciiTheme="minorHAnsi" w:hAnsiTheme="minorHAnsi" w:cstheme="minorHAnsi"/>
-                <w:b/>
-                <w:bCs/>
-                <w:sz w:val="20"/>
-                <w:szCs w:val="24"/>
-              </w:rPr>
-              <w:t>}</w:t>
             </w:r>
           </w:p>
         </w:tc>
@@ -2466,8 +2250,8 @@
         </w:tc>
         <w:tc>
           <w:tcPr>
-            <w:tcW w:w="1985" w:type="dxa"/>
-            <w:gridSpan w:val="2"/>
+            <w:tcW w:w="3827" w:type="dxa"/>
+            <w:gridSpan w:val="4"/>
           </w:tcPr>
           <w:p>
             <w:pPr>
@@ -2485,32 +2269,6 @@
                 <w:szCs w:val="18"/>
               </w:rPr>
               <w:t>{</w:t>
-            </w:r>
-            <w:proofErr w:type="spellStart"/>
-            <w:r>
-              <w:rPr>
-                <w:rFonts w:ascii="Arial" w:hAnsi="Arial" w:cs="Arial"/>
-                <w:sz w:val="18"/>
-                <w:szCs w:val="18"/>
-              </w:rPr>
-              <w:t>materialGrade</w:t>
-            </w:r>
-            <w:proofErr w:type="spellEnd"/>
-            <w:r>
-              <w:rPr>
-                <w:rFonts w:ascii="Arial" w:hAnsi="Arial" w:cs="Arial"/>
-                <w:sz w:val="18"/>
-                <w:szCs w:val="18"/>
-              </w:rPr>
-              <w:t>}{</w:t>
-            </w:r>
-            <w:r>
-              <w:rPr>
-                <w:rFonts w:ascii="Arial" w:hAnsi="Arial" w:cs="Arial"/>
-                <w:sz w:val="18"/>
-                <w:szCs w:val="18"/>
-              </w:rPr>
-              <w:t>^</w:t>
             </w:r>
             <w:proofErr w:type="spellStart"/>
             <w:proofErr w:type="gramStart"/>
@@ -2520,7 +2278,7 @@
                 <w:sz w:val="18"/>
                 <w:szCs w:val="18"/>
               </w:rPr>
-              <w:t>isAus</w:t>
+              <w:t>materialGrade</w:t>
             </w:r>
             <w:proofErr w:type="spellEnd"/>
             <w:r>
@@ -2529,8 +2287,17 @@
                 <w:sz w:val="18"/>
                 <w:szCs w:val="18"/>
               </w:rPr>
-              <w:t xml:space="preserve">}  </w:t>
-            </w:r>
+              <w:t>}</w:t>
+            </w:r>
+            <w:r>
+              <w:rPr>
+                <w:rFonts w:ascii="Arial" w:hAnsi="Arial" w:cs="Arial"/>
+                <w:sz w:val="18"/>
+                <w:szCs w:val="18"/>
+              </w:rPr>
+              <w:t xml:space="preserve">   </w:t>
+            </w:r>
+            <w:proofErr w:type="gramEnd"/>
             <w:r>
               <w:rPr>
                 <w:rFonts w:ascii="Arial" w:hAnsi="Arial" w:cs="Arial"/>
@@ -2540,7 +2307,6 @@
               <w:t>{</w:t>
             </w:r>
             <w:proofErr w:type="spellStart"/>
-            <w:proofErr w:type="gramEnd"/>
             <w:r>
               <w:rPr>
                 <w:rFonts w:ascii="Arial" w:hAnsi="Arial" w:cs="Arial"/>
@@ -2550,114 +2316,6 @@
               <w:t>brandName</w:t>
             </w:r>
             <w:proofErr w:type="spellEnd"/>
-            <w:r>
-              <w:rPr>
-                <w:rFonts w:ascii="Arial" w:hAnsi="Arial" w:cs="Arial"/>
-                <w:sz w:val="18"/>
-                <w:szCs w:val="18"/>
-              </w:rPr>
-              <w:t>}{/</w:t>
-            </w:r>
-            <w:proofErr w:type="spellStart"/>
-            <w:r>
-              <w:rPr>
-                <w:rFonts w:ascii="Arial" w:hAnsi="Arial" w:cs="Arial"/>
-                <w:sz w:val="18"/>
-                <w:szCs w:val="18"/>
-              </w:rPr>
-              <w:t>isAus</w:t>
-            </w:r>
-            <w:proofErr w:type="spellEnd"/>
-            <w:r>
-              <w:rPr>
-                <w:rFonts w:ascii="Arial" w:hAnsi="Arial" w:cs="Arial"/>
-                <w:sz w:val="18"/>
-                <w:szCs w:val="18"/>
-              </w:rPr>
-              <w:t>}</w:t>
-            </w:r>
-          </w:p>
-        </w:tc>
-        <w:tc>
-          <w:tcPr>
-            <w:tcW w:w="1842" w:type="dxa"/>
-            <w:gridSpan w:val="2"/>
-          </w:tcPr>
-          <w:p>
-            <w:pPr>
-              <w:ind w:right="113"/>
-              <w:rPr>
-                <w:rFonts w:ascii="Arial" w:hAnsi="Arial" w:cs="Arial"/>
-                <w:sz w:val="18"/>
-                <w:szCs w:val="18"/>
-              </w:rPr>
-            </w:pPr>
-            <w:r>
-              <w:rPr>
-                <w:rFonts w:ascii="Arial" w:hAnsi="Arial" w:cs="Arial"/>
-                <w:sz w:val="18"/>
-                <w:szCs w:val="18"/>
-              </w:rPr>
-              <w:t>{</w:t>
-            </w:r>
-            <w:r>
-              <w:rPr>
-                <w:rFonts w:ascii="Arial" w:hAnsi="Arial" w:cs="Arial"/>
-                <w:sz w:val="18"/>
-                <w:szCs w:val="18"/>
-              </w:rPr>
-              <w:t>#</w:t>
-            </w:r>
-            <w:proofErr w:type="gramStart"/>
-            <w:r>
-              <w:rPr>
-                <w:rFonts w:ascii="Arial" w:hAnsi="Arial" w:cs="Arial"/>
-                <w:sz w:val="18"/>
-                <w:szCs w:val="18"/>
-              </w:rPr>
-              <w:t>isAus</w:t>
-            </w:r>
-            <w:r>
-              <w:rPr>
-                <w:rFonts w:ascii="Arial" w:hAnsi="Arial" w:cs="Arial"/>
-                <w:sz w:val="18"/>
-                <w:szCs w:val="18"/>
-              </w:rPr>
-              <w:t>}{</w:t>
-            </w:r>
-            <w:proofErr w:type="gramEnd"/>
-            <w:r>
-              <w:rPr>
-                <w:rFonts w:ascii="Arial" w:hAnsi="Arial" w:cs="Arial"/>
-                <w:sz w:val="18"/>
-                <w:szCs w:val="18"/>
-              </w:rPr>
-              <w:t>brandName}</w:t>
-            </w:r>
-            <w:r>
-              <w:rPr>
-                <w:rFonts w:ascii="Arial" w:hAnsi="Arial" w:cs="Arial"/>
-                <w:sz w:val="18"/>
-                <w:szCs w:val="18"/>
-              </w:rPr>
-              <w:t>{</w:t>
-            </w:r>
-            <w:r>
-              <w:rPr>
-                <w:rFonts w:ascii="Arial" w:hAnsi="Arial" w:cs="Arial"/>
-                <w:sz w:val="18"/>
-                <w:szCs w:val="18"/>
-              </w:rPr>
-              <w:t>/</w:t>
-            </w:r>
-            <w:r>
-              <w:rPr>
-                <w:rFonts w:ascii="Arial" w:hAnsi="Arial" w:cs="Arial"/>
-                <w:sz w:val="18"/>
-                <w:szCs w:val="18"/>
-              </w:rPr>
-              <w:t>isAus</w:t>
-            </w:r>
             <w:r>
               <w:rPr>
                 <w:rFonts w:ascii="Arial" w:hAnsi="Arial" w:cs="Arial"/>

</xml_diff>